<commit_message>
quiz 3 finished , reviewing quiz2 , todo quiz1
</commit_message>
<xml_diff>
--- a/Operating System Quiz 2_answer.docx
+++ b/Operating System Quiz 2_answer.docx
@@ -1,10 +1,10 @@
 
 <file path=word/document.xml><?xml version="1.0" encoding="utf-8"?>
-<w:document xmlns:wpc="http://schemas.microsoft.com/office/word/2010/wordprocessingCanvas" xmlns:cx="http://schemas.microsoft.com/office/drawing/2014/chartex" xmlns:cx1="http://schemas.microsoft.com/office/drawing/2015/9/8/chartex" xmlns:cx2="http://schemas.microsoft.com/office/drawing/2015/10/21/chartex" xmlns:cx3="http://schemas.microsoft.com/office/drawing/2016/5/9/chartex" xmlns:cx4="http://schemas.microsoft.com/office/drawing/2016/5/10/chartex" xmlns:cx5="http://schemas.microsoft.com/office/drawing/2016/5/11/chartex" xmlns:cx6="http://schemas.microsoft.com/office/drawing/2016/5/12/chartex" xmlns:cx7="http://schemas.microsoft.com/office/drawing/2016/5/13/chartex" xmlns:cx8="http://schemas.microsoft.com/office/drawing/2016/5/14/chartex" xmlns:mc="http://schemas.openxmlformats.org/markup-compatibility/2006" xmlns:aink="http://schemas.microsoft.com/office/drawing/2016/ink" xmlns:am3d="http://schemas.microsoft.com/office/drawing/2017/model3d" xmlns:o="urn:schemas-microsoft-com:office:office" xmlns:r="http://schemas.openxmlformats.org/officeDocument/2006/relationships" xmlns:m="http://schemas.openxmlformats.org/officeDocument/2006/math" xmlns:v="urn:schemas-microsoft-com:vml" xmlns:wp14="http://schemas.microsoft.com/office/word/2010/wordprocessingDrawing" xmlns:wp="http://schemas.openxmlformats.org/drawingml/2006/wordprocessingDrawing" xmlns:w10="urn:schemas-microsoft-com:office:word" xmlns:w="http://schemas.openxmlformats.org/wordprocessingml/2006/main" xmlns:w14="http://schemas.microsoft.com/office/word/2010/wordml" xmlns:w15="http://schemas.microsoft.com/office/word/2012/wordml" xmlns:w16cex="http://schemas.microsoft.com/office/word/2018/wordml/cex" xmlns:w16cid="http://schemas.microsoft.com/office/word/2016/wordml/cid" xmlns:w16="http://schemas.microsoft.com/office/word/2018/wordml" xmlns:w16sdtdh="http://schemas.microsoft.com/office/word/2020/wordml/sdtdatahash" xmlns:w16se="http://schemas.microsoft.com/office/word/2015/wordml/symex" xmlns:wpg="http://schemas.microsoft.com/office/word/2010/wordprocessingGroup" xmlns:wpi="http://schemas.microsoft.com/office/word/2010/wordprocessingInk" xmlns:wne="http://schemas.microsoft.com/office/word/2006/wordml" xmlns:wps="http://schemas.microsoft.com/office/word/2010/wordprocessingShape" mc:Ignorable="w14 w15 w16se w16cid w16 w16cex w16sdtdh wp14">
+<w:document xmlns:wpc="http://schemas.microsoft.com/office/word/2010/wordprocessingCanvas" xmlns:cx="http://schemas.microsoft.com/office/drawing/2014/chartex" xmlns:mc="http://schemas.openxmlformats.org/markup-compatibility/2006" xmlns:o="urn:schemas-microsoft-com:office:office" xmlns:r="http://schemas.openxmlformats.org/officeDocument/2006/relationships" xmlns:m="http://schemas.openxmlformats.org/officeDocument/2006/math" xmlns:v="urn:schemas-microsoft-com:vml" xmlns:wp14="http://schemas.microsoft.com/office/word/2010/wordprocessingDrawing" xmlns:wp="http://schemas.openxmlformats.org/drawingml/2006/wordprocessingDrawing" xmlns:w10="urn:schemas-microsoft-com:office:word" xmlns:w="http://schemas.openxmlformats.org/wordprocessingml/2006/main" xmlns:w14="http://schemas.microsoft.com/office/word/2010/wordml" xmlns:w15="http://schemas.microsoft.com/office/word/2012/wordml" xmlns:w16se="http://schemas.microsoft.com/office/word/2015/wordml/symex" xmlns:wpg="http://schemas.microsoft.com/office/word/2010/wordprocessingGroup" xmlns:wpi="http://schemas.microsoft.com/office/word/2010/wordprocessingInk" xmlns:wne="http://schemas.microsoft.com/office/word/2006/wordml" xmlns:wps="http://schemas.microsoft.com/office/word/2010/wordprocessingShape" mc:Ignorable="w14 w15 w16se wp14">
   <w:body>
     <w:p>
       <w:pPr>
-        <w:pStyle w:val="Heading1"/>
+        <w:pStyle w:val="1"/>
         <w:jc w:val="center"/>
       </w:pPr>
       <w:r>
@@ -62,7 +62,7 @@
     </w:p>
     <w:p>
       <w:pPr>
-        <w:pStyle w:val="ListParagraph"/>
+        <w:pStyle w:val="a3"/>
         <w:numPr>
           <w:ilvl w:val="0"/>
           <w:numId w:val="1"/>
@@ -74,12 +74,12 @@
     </w:p>
     <w:p>
       <w:pPr>
-        <w:pStyle w:val="ListParagraph"/>
-      </w:pPr>
-    </w:p>
-    <w:p>
-      <w:pPr>
-        <w:pStyle w:val="ListParagraph"/>
+        <w:pStyle w:val="a3"/>
+      </w:pPr>
+    </w:p>
+    <w:p>
+      <w:pPr>
+        <w:pStyle w:val="a3"/>
         <w:numPr>
           <w:ilvl w:val="0"/>
           <w:numId w:val="13"/>
@@ -91,7 +91,7 @@
     </w:p>
     <w:p>
       <w:pPr>
-        <w:pStyle w:val="ListParagraph"/>
+        <w:pStyle w:val="a3"/>
         <w:numPr>
           <w:ilvl w:val="0"/>
           <w:numId w:val="13"/>
@@ -103,7 +103,7 @@
     </w:p>
     <w:p>
       <w:pPr>
-        <w:pStyle w:val="ListParagraph"/>
+        <w:pStyle w:val="a3"/>
         <w:numPr>
           <w:ilvl w:val="0"/>
           <w:numId w:val="13"/>
@@ -115,7 +115,7 @@
     </w:p>
     <w:p>
       <w:pPr>
-        <w:pStyle w:val="ListParagraph"/>
+        <w:pStyle w:val="a3"/>
         <w:numPr>
           <w:ilvl w:val="0"/>
           <w:numId w:val="13"/>
@@ -127,7 +127,7 @@
     </w:p>
     <w:p>
       <w:pPr>
-        <w:pStyle w:val="ListParagraph"/>
+        <w:pStyle w:val="a3"/>
         <w:numPr>
           <w:ilvl w:val="0"/>
           <w:numId w:val="13"/>
@@ -138,37 +138,186 @@
       </w:r>
     </w:p>
     <w:p/>
-    <w:p/>
-    <w:p/>
-    <w:p>
-      <w:pPr>
-        <w:rPr>
-          <w:color w:val="FF0000"/>
-        </w:rPr>
-      </w:pPr>
-      <w:r>
-        <w:rPr>
-          <w:color w:val="FF0000"/>
-        </w:rPr>
-        <w:t xml:space="preserve">               </w:t>
-      </w:r>
-      <w:r>
-        <w:rPr>
-          <w:color w:val="FF0000"/>
-        </w:rPr>
-        <w:t>2^16, 2^16, 16, 16, 2^4</w:t>
-      </w:r>
-    </w:p>
-    <w:p>
-      <w:pPr>
-        <w:ind w:left="360"/>
-      </w:pPr>
-    </w:p>
-    <w:p/>
-    <w:p/>
-    <w:p>
-      <w:pPr>
-        <w:pStyle w:val="ListParagraph"/>
+    <w:p>
+      <w:pPr>
+        <w:rPr>
+          <w:rFonts w:hint="eastAsia"/>
+        </w:rPr>
+      </w:pPr>
+      <w:r>
+        <w:rPr>
+          <w:rFonts w:hint="eastAsia"/>
+        </w:rPr>
+        <w:t>第一题就是</w:t>
+      </w:r>
+      <w:r>
+        <w:rPr>
+          <w:rFonts w:hint="eastAsia"/>
+        </w:rPr>
+        <w:t>4GB</w:t>
+      </w:r>
+      <w:r>
+        <w:t xml:space="preserve"> / 64</w:t>
+      </w:r>
+      <w:r>
+        <w:rPr>
+          <w:rFonts w:hint="eastAsia"/>
+        </w:rPr>
+        <w:t>KB</w:t>
+      </w:r>
+      <w:r>
+        <w:t xml:space="preserve"> </w:t>
+      </w:r>
+    </w:p>
+    <w:p>
+      <w:r>
+        <w:rPr>
+          <w:rFonts w:hint="eastAsia"/>
+        </w:rPr>
+        <w:t>第三题</w:t>
+      </w:r>
+      <w:r>
+        <w:rPr>
+          <w:rFonts w:hint="eastAsia"/>
+        </w:rPr>
+        <w:t xml:space="preserve"> </w:t>
+      </w:r>
+      <w:r>
+        <w:t xml:space="preserve"> 2</w:t>
+      </w:r>
+      <w:r>
+        <w:rPr>
+          <w:rFonts w:hint="eastAsia"/>
+        </w:rPr>
+        <w:t>的</w:t>
+      </w:r>
+      <w:r>
+        <w:rPr>
+          <w:rFonts w:hint="eastAsia"/>
+        </w:rPr>
+        <w:t>1</w:t>
+      </w:r>
+      <w:r>
+        <w:t>6</w:t>
+      </w:r>
+      <w:r>
+        <w:rPr>
+          <w:rFonts w:hint="eastAsia"/>
+        </w:rPr>
+        <w:t>次方</w:t>
+      </w:r>
+      <w:r>
+        <w:rPr>
+          <w:rFonts w:hint="eastAsia"/>
+        </w:rPr>
+        <w:t>=</w:t>
+      </w:r>
+      <w:r>
+        <w:t xml:space="preserve">  64</w:t>
+      </w:r>
+      <w:r>
+        <w:rPr>
+          <w:rFonts w:hint="eastAsia"/>
+        </w:rPr>
+        <w:t>KB</w:t>
+      </w:r>
+      <w:r>
+        <w:t xml:space="preserve"> </w:t>
+      </w:r>
+    </w:p>
+    <w:p>
+      <w:pPr>
+        <w:rPr>
+          <w:rFonts w:hint="eastAsia"/>
+        </w:rPr>
+      </w:pPr>
+      <w:r>
+        <w:rPr>
+          <w:rFonts w:hint="eastAsia"/>
+        </w:rPr>
+        <w:t>第五题</w:t>
+      </w:r>
+      <w:r>
+        <w:rPr>
+          <w:rFonts w:hint="eastAsia"/>
+        </w:rPr>
+        <w:t xml:space="preserve"> </w:t>
+      </w:r>
+      <w:r>
+        <w:t>2</w:t>
+      </w:r>
+      <w:r>
+        <w:rPr>
+          <w:rFonts w:hint="eastAsia"/>
+        </w:rPr>
+        <w:t>的</w:t>
+      </w:r>
+      <w:r>
+        <w:rPr>
+          <w:rFonts w:hint="eastAsia"/>
+        </w:rPr>
+        <w:t>2</w:t>
+      </w:r>
+      <w:r>
+        <w:t>0 /2</w:t>
+      </w:r>
+      <w:r>
+        <w:rPr>
+          <w:rFonts w:hint="eastAsia"/>
+        </w:rPr>
+        <w:t>的</w:t>
+      </w:r>
+      <w:r>
+        <w:rPr>
+          <w:rFonts w:hint="eastAsia"/>
+        </w:rPr>
+        <w:t>1</w:t>
+      </w:r>
+      <w:r>
+        <w:t>6  =  2</w:t>
+      </w:r>
+      <w:r>
+        <w:rPr>
+          <w:rFonts w:hint="eastAsia"/>
+        </w:rPr>
+        <w:t>的</w:t>
+      </w:r>
+      <w:r>
+        <w:rPr>
+          <w:rFonts w:hint="eastAsia"/>
+        </w:rPr>
+        <w:t>4</w:t>
+      </w:r>
+      <w:r>
+        <w:rPr>
+          <w:rFonts w:hint="eastAsia"/>
+        </w:rPr>
+        <w:t>次</w:t>
+      </w:r>
+    </w:p>
+    <w:p>
+      <w:pPr>
+        <w:rPr>
+          <w:color w:val="FF0000"/>
+        </w:rPr>
+      </w:pPr>
+      <w:r>
+        <w:rPr>
+          <w:color w:val="FF0000"/>
+        </w:rPr>
+        <w:t xml:space="preserve">               2^16, 2^16, 16, 16, 2^4</w:t>
+      </w:r>
+    </w:p>
+    <w:p>
+      <w:pPr>
+        <w:rPr>
+          <w:rFonts w:hint="eastAsia"/>
+        </w:rPr>
+      </w:pPr>
+    </w:p>
+    <w:p>
+      <w:pPr>
+        <w:pStyle w:val="a3"/>
         <w:numPr>
           <w:ilvl w:val="0"/>
           <w:numId w:val="1"/>
@@ -704,7 +853,7 @@
     </w:p>
     <w:p>
       <w:pPr>
-        <w:pStyle w:val="ListParagraph"/>
+        <w:pStyle w:val="a3"/>
         <w:numPr>
           <w:ilvl w:val="0"/>
           <w:numId w:val="14"/>
@@ -750,7 +899,7 @@
     </w:p>
     <w:p>
       <w:pPr>
-        <w:pStyle w:val="ListParagraph"/>
+        <w:pStyle w:val="a3"/>
         <w:spacing w:before="100" w:beforeAutospacing="1" w:after="100" w:afterAutospacing="1"/>
         <w:ind w:left="960"/>
         <w:rPr>
@@ -760,11 +909,10 @@
     </w:p>
     <w:p>
       <w:pPr>
-        <w:pStyle w:val="ListParagraph"/>
+        <w:pStyle w:val="a3"/>
         <w:spacing w:before="100" w:beforeAutospacing="1" w:after="100" w:afterAutospacing="1"/>
         <w:ind w:left="960"/>
         <w:rPr>
-          <w:rFonts w:ascii="Times New Roman" w:eastAsia="Times New Roman" w:hAnsi="Times New Roman" w:cs="Times New Roman"/>
           <w:color w:val="FF0000"/>
         </w:rPr>
       </w:pPr>
@@ -777,17 +925,68 @@
     </w:p>
     <w:p>
       <w:pPr>
-        <w:pStyle w:val="ListParagraph"/>
+        <w:pStyle w:val="a3"/>
         <w:spacing w:before="100" w:beforeAutospacing="1" w:after="100" w:afterAutospacing="1"/>
         <w:ind w:left="960"/>
         <w:rPr>
+          <w:color w:val="FF0000"/>
+        </w:rPr>
+      </w:pPr>
+    </w:p>
+    <w:p>
+      <w:pPr>
+        <w:pStyle w:val="a3"/>
+        <w:spacing w:before="100" w:beforeAutospacing="1" w:after="100" w:afterAutospacing="1"/>
+        <w:ind w:left="960"/>
+        <w:rPr>
+          <w:color w:val="FF0000"/>
+        </w:rPr>
+      </w:pPr>
+      <w:r>
+        <w:rPr>
+          <w:rFonts w:hint="eastAsia"/>
+          <w:color w:val="FF0000"/>
+        </w:rPr>
+        <w:t>4*2048+56=8248</w:t>
+      </w:r>
+      <w:r>
+        <w:rPr>
+          <w:color w:val="FF0000"/>
+        </w:rPr>
+        <w:t xml:space="preserve">  </w:t>
+      </w:r>
+    </w:p>
+    <w:p>
+      <w:pPr>
+        <w:pStyle w:val="a3"/>
+        <w:spacing w:before="100" w:beforeAutospacing="1" w:after="100" w:afterAutospacing="1"/>
+        <w:ind w:left="960"/>
+        <w:rPr>
           <w:rFonts w:ascii="Times New Roman" w:eastAsia="Times New Roman" w:hAnsi="Times New Roman" w:cs="Times New Roman"/>
-        </w:rPr>
-      </w:pPr>
-    </w:p>
-    <w:p>
-      <w:pPr>
-        <w:pStyle w:val="ListParagraph"/>
+          <w:color w:val="FF0000"/>
+        </w:rPr>
+      </w:pPr>
+      <w:r>
+        <w:rPr>
+          <w:rFonts w:hint="eastAsia"/>
+          <w:color w:val="FF0000"/>
+        </w:rPr>
+        <w:t>4*2048+1024=9216</w:t>
+      </w:r>
+    </w:p>
+    <w:p>
+      <w:pPr>
+        <w:pStyle w:val="a3"/>
+        <w:spacing w:before="100" w:beforeAutospacing="1" w:after="100" w:afterAutospacing="1"/>
+        <w:ind w:left="960"/>
+        <w:rPr>
+          <w:rFonts w:ascii="Times New Roman" w:eastAsia="Times New Roman" w:hAnsi="Times New Roman" w:cs="Times New Roman"/>
+        </w:rPr>
+      </w:pPr>
+    </w:p>
+    <w:p>
+      <w:pPr>
+        <w:pStyle w:val="a3"/>
         <w:numPr>
           <w:ilvl w:val="0"/>
           <w:numId w:val="1"/>
@@ -801,26 +1000,12 @@
         <w:rPr>
           <w:rFonts w:ascii="Times New Roman" w:eastAsia="Times New Roman" w:hAnsi="Times New Roman" w:cs="Times New Roman"/>
         </w:rPr>
-        <w:t xml:space="preserve">Suppose that there are only 3 frames of physical memory (initially empty), and a process accesses its page in the following order: 1,2,3,4,2,1,5,6,2,1,2,3,7,6,3,2,1,2,3,6. Show which pages are in each </w:t>
-      </w:r>
-      <w:proofErr w:type="gramStart"/>
-      <w:r>
-        <w:rPr>
-          <w:rFonts w:ascii="Times New Roman" w:eastAsia="Times New Roman" w:hAnsi="Times New Roman" w:cs="Times New Roman"/>
-        </w:rPr>
-        <w:t>frames</w:t>
-      </w:r>
-      <w:proofErr w:type="gramEnd"/>
-      <w:r>
-        <w:rPr>
-          <w:rFonts w:ascii="Times New Roman" w:eastAsia="Times New Roman" w:hAnsi="Times New Roman" w:cs="Times New Roman"/>
-        </w:rPr>
-        <w:t xml:space="preserve"> as the pages are reference and give the total number of page faults using each of the following page replacement algorithms:</w:t>
-      </w:r>
-    </w:p>
-    <w:p>
-      <w:pPr>
-        <w:pStyle w:val="ListParagraph"/>
+        <w:t>Suppose that there are only 3 frames of physical memory (initially empty), and a process accesses its page in the following order: 1,2,3,4,2,1,5,6,2,1,2,3,7,6,3,2,1,2,3,6. Show which pages are in each frames as the pages are reference and give the total number of page faults using each of the following page replacement algorithms:</w:t>
+      </w:r>
+    </w:p>
+    <w:p>
+      <w:pPr>
+        <w:pStyle w:val="a3"/>
         <w:numPr>
           <w:ilvl w:val="0"/>
           <w:numId w:val="15"/>
@@ -851,7 +1036,7 @@
     </w:p>
     <w:p>
       <w:pPr>
-        <w:pStyle w:val="ListParagraph"/>
+        <w:pStyle w:val="a3"/>
         <w:numPr>
           <w:ilvl w:val="0"/>
           <w:numId w:val="15"/>
@@ -865,12 +1050,13 @@
         <w:rPr>
           <w:rFonts w:ascii="Times New Roman" w:eastAsia="Times New Roman" w:hAnsi="Times New Roman" w:cs="Times New Roman"/>
         </w:rPr>
+        <w:lastRenderedPageBreak/>
         <w:t>LRU</w:t>
       </w:r>
     </w:p>
     <w:p>
       <w:pPr>
-        <w:pStyle w:val="ListParagraph"/>
+        <w:pStyle w:val="a3"/>
         <w:numPr>
           <w:ilvl w:val="0"/>
           <w:numId w:val="15"/>
@@ -889,7 +1075,7 @@
     </w:p>
     <w:p>
       <w:pPr>
-        <w:pStyle w:val="ListParagraph"/>
+        <w:pStyle w:val="a3"/>
         <w:numPr>
           <w:ilvl w:val="0"/>
           <w:numId w:val="15"/>
@@ -903,47 +1089,97 @@
         <w:rPr>
           <w:rFonts w:ascii="Times New Roman" w:eastAsia="Times New Roman" w:hAnsi="Times New Roman" w:cs="Times New Roman"/>
         </w:rPr>
-        <w:lastRenderedPageBreak/>
         <w:t>Second Chance</w:t>
       </w:r>
     </w:p>
     <w:p>
       <w:pPr>
-        <w:pStyle w:val="ListParagraph"/>
-      </w:pPr>
-    </w:p>
-    <w:p>
-      <w:pPr>
-        <w:pStyle w:val="ListParagraph"/>
-      </w:pPr>
-    </w:p>
-    <w:p>
-      <w:pPr>
-        <w:pStyle w:val="ListParagraph"/>
-        <w:rPr>
-          <w:color w:val="FF0000"/>
-        </w:rPr>
-      </w:pPr>
-      <w:r>
-        <w:rPr>
-          <w:color w:val="FF0000"/>
-        </w:rPr>
-        <w:t>16, 15, 11, 16</w:t>
-      </w:r>
-    </w:p>
-    <w:p>
-      <w:pPr>
-        <w:pStyle w:val="ListParagraph"/>
-      </w:pPr>
-    </w:p>
-    <w:p>
-      <w:pPr>
-        <w:pStyle w:val="ListParagraph"/>
-      </w:pPr>
-    </w:p>
-    <w:p>
-      <w:pPr>
-        <w:pStyle w:val="ListParagraph"/>
+        <w:pStyle w:val="a3"/>
+      </w:pPr>
+    </w:p>
+    <w:p>
+      <w:pPr>
+        <w:pStyle w:val="a3"/>
+      </w:pPr>
+    </w:p>
+    <w:p>
+      <w:pPr>
+        <w:pStyle w:val="a3"/>
+        <w:rPr>
+          <w:color w:val="FF0000"/>
+        </w:rPr>
+      </w:pPr>
+      <w:r>
+        <w:rPr>
+          <w:color w:val="FF0000"/>
+        </w:rPr>
+        <w:t>16</w:t>
+      </w:r>
+      <w:r>
+        <w:rPr>
+          <w:color w:val="FF0000"/>
+        </w:rPr>
+        <w:t xml:space="preserve"> </w:t>
+      </w:r>
+      <w:r>
+        <w:rPr>
+          <w:rFonts w:hint="eastAsia"/>
+          <w:color w:val="FF0000"/>
+        </w:rPr>
+        <w:t>算错了</w:t>
+      </w:r>
+      <w:r>
+        <w:rPr>
+          <w:color w:val="FF0000"/>
+        </w:rPr>
+        <w:t>, 15</w:t>
+      </w:r>
+      <w:r>
+        <w:rPr>
+          <w:color w:val="FF0000"/>
+        </w:rPr>
+        <w:t xml:space="preserve"> </w:t>
+      </w:r>
+      <w:r>
+        <w:rPr>
+          <w:rFonts w:hint="eastAsia"/>
+          <w:color w:val="FF0000"/>
+        </w:rPr>
+        <w:t>对</w:t>
+      </w:r>
+      <w:r>
+        <w:rPr>
+          <w:color w:val="FF0000"/>
+        </w:rPr>
+        <w:t>, 11</w:t>
+      </w:r>
+      <w:r>
+        <w:rPr>
+          <w:rFonts w:hint="eastAsia"/>
+          <w:color w:val="FF0000"/>
+        </w:rPr>
+        <w:t>算对了</w:t>
+      </w:r>
+      <w:r>
+        <w:rPr>
+          <w:color w:val="FF0000"/>
+        </w:rPr>
+        <w:t>, 16</w:t>
+      </w:r>
+    </w:p>
+    <w:p>
+      <w:pPr>
+        <w:pStyle w:val="a3"/>
+      </w:pPr>
+    </w:p>
+    <w:p>
+      <w:pPr>
+        <w:pStyle w:val="a3"/>
+      </w:pPr>
+    </w:p>
+    <w:p>
+      <w:pPr>
+        <w:pStyle w:val="a3"/>
         <w:numPr>
           <w:ilvl w:val="0"/>
           <w:numId w:val="1"/>
@@ -969,7 +1205,13 @@
         <w:rPr>
           <w:rFonts w:ascii="Times New Roman" w:eastAsia="Times New Roman" w:hAnsi="Times New Roman" w:cs="Times New Roman"/>
         </w:rPr>
-        <w:t>Assume that the page to be replaced is modified 70 percent of the time. What is the maximum acceptable page-fault rate for an effective access time of no more than 200 nanoseconds?</w:t>
+        <w:t xml:space="preserve">Assume that the page to be replaced is modified 70 percent of the time. </w:t>
+      </w:r>
+      <w:r>
+        <w:rPr>
+          <w:rFonts w:ascii="Times New Roman" w:eastAsia="Times New Roman" w:hAnsi="Times New Roman" w:cs="Times New Roman"/>
+        </w:rPr>
+        <w:t>What is the maximum acceptable page-fault rate for an effective access time of no more than 200 nanoseconds?</w:t>
       </w:r>
     </w:p>
     <w:p>
@@ -1090,6 +1332,12 @@
         </w:rPr>
         <w:t xml:space="preserve"> 16,400 P</w:t>
       </w:r>
+      <w:r>
+        <w:rPr>
+          <w:color w:val="FF0000"/>
+        </w:rPr>
+        <w:t xml:space="preserve">    </w:t>
+      </w:r>
     </w:p>
     <w:p>
       <w:pPr>
@@ -1117,18 +1365,38 @@
         </w:rPr>
         <w:t xml:space="preserve"> 0.000006</w:t>
       </w:r>
+      <w:r>
+        <w:rPr>
+          <w:color w:val="FF0000"/>
+        </w:rPr>
+        <w:t xml:space="preserve">  </w:t>
+      </w:r>
+      <w:r>
+        <w:rPr>
+          <w:rFonts w:hint="eastAsia"/>
+          <w:color w:val="FF0000"/>
+        </w:rPr>
+        <w:t>算对了</w:t>
+      </w:r>
+      <w:r>
+        <w:rPr>
+          <w:rFonts w:hint="eastAsia"/>
+          <w:color w:val="FF0000"/>
+        </w:rPr>
+        <w:t xml:space="preserve"> </w:t>
+      </w:r>
     </w:p>
     <w:p>
       <w:pPr>
         <w:spacing w:before="100" w:beforeAutospacing="1" w:after="100" w:afterAutospacing="1"/>
         <w:rPr>
-          <w:rFonts w:ascii="Times New Roman" w:eastAsia="Times New Roman" w:hAnsi="Times New Roman" w:cs="Times New Roman" w:hint="eastAsia"/>
-        </w:rPr>
-      </w:pPr>
-    </w:p>
-    <w:p>
-      <w:pPr>
-        <w:pStyle w:val="ListParagraph"/>
+          <w:rFonts w:ascii="Times New Roman" w:eastAsia="Times New Roman" w:hAnsi="Times New Roman" w:cs="Times New Roman"/>
+        </w:rPr>
+      </w:pPr>
+    </w:p>
+    <w:p>
+      <w:pPr>
+        <w:pStyle w:val="a3"/>
         <w:numPr>
           <w:ilvl w:val="0"/>
           <w:numId w:val="1"/>
@@ -1161,7 +1429,7 @@
     </w:p>
     <w:p>
       <w:pPr>
-        <w:pStyle w:val="ListParagraph"/>
+        <w:pStyle w:val="a3"/>
         <w:spacing w:before="100" w:beforeAutospacing="1" w:after="100" w:afterAutospacing="1"/>
         <w:rPr>
           <w:rFonts w:ascii="Times New Roman" w:eastAsia="Times New Roman" w:hAnsi="Times New Roman" w:cs="Times New Roman"/>
@@ -1170,7 +1438,7 @@
     </w:p>
     <w:p>
       <w:pPr>
-        <w:pStyle w:val="ListParagraph"/>
+        <w:pStyle w:val="a3"/>
         <w:spacing w:before="100" w:beforeAutospacing="1" w:after="100" w:afterAutospacing="1"/>
         <w:rPr>
           <w:rFonts w:ascii="Times New Roman" w:eastAsia="Times New Roman" w:hAnsi="Times New Roman" w:cs="Times New Roman"/>
@@ -1217,7 +1485,7 @@
     </w:p>
     <w:p>
       <w:pPr>
-        <w:pStyle w:val="ListParagraph"/>
+        <w:pStyle w:val="a3"/>
         <w:spacing w:before="100" w:beforeAutospacing="1" w:after="100" w:afterAutospacing="1"/>
         <w:rPr>
           <w:rFonts w:ascii="Times New Roman" w:eastAsia="Times New Roman" w:hAnsi="Times New Roman" w:cs="Times New Roman"/>
@@ -1250,7 +1518,7 @@
     </w:p>
     <w:p>
       <w:pPr>
-        <w:pStyle w:val="ListParagraph"/>
+        <w:pStyle w:val="a3"/>
         <w:spacing w:before="100" w:beforeAutospacing="1" w:after="100" w:afterAutospacing="1"/>
         <w:rPr>
           <w:rFonts w:ascii="Times New Roman" w:eastAsia="Times New Roman" w:hAnsi="Times New Roman" w:cs="Times New Roman"/>
@@ -1267,7 +1535,7 @@
     </w:p>
     <w:p>
       <w:pPr>
-        <w:pStyle w:val="ListParagraph"/>
+        <w:pStyle w:val="a3"/>
         <w:spacing w:before="100" w:beforeAutospacing="1" w:after="100" w:afterAutospacing="1"/>
         <w:rPr>
           <w:rFonts w:ascii="Times New Roman" w:eastAsia="Times New Roman" w:hAnsi="Times New Roman" w:cs="Times New Roman"/>
@@ -1277,24 +1545,24 @@
     </w:p>
     <w:p>
       <w:pPr>
-        <w:pStyle w:val="ListParagraph"/>
+        <w:pStyle w:val="a3"/>
         <w:spacing w:before="100" w:beforeAutospacing="1" w:after="100" w:afterAutospacing="1"/>
         <w:rPr>
-          <w:rFonts w:ascii="Times New Roman" w:eastAsia="Times New Roman" w:hAnsi="Times New Roman" w:cs="Times New Roman" w:hint="eastAsia"/>
-          <w:color w:val="FF0000"/>
-        </w:rPr>
-      </w:pPr>
-      <w:r>
-        <w:rPr>
           <w:rFonts w:ascii="Times New Roman" w:eastAsia="Times New Roman" w:hAnsi="Times New Roman" w:cs="Times New Roman"/>
           <w:color w:val="FF0000"/>
         </w:rPr>
+      </w:pPr>
+      <w:r>
+        <w:rPr>
+          <w:rFonts w:ascii="Times New Roman" w:eastAsia="Times New Roman" w:hAnsi="Times New Roman" w:cs="Times New Roman"/>
+          <w:color w:val="FF0000"/>
+        </w:rPr>
         <w:t>Best fit</w:t>
       </w:r>
     </w:p>
     <w:p>
       <w:pPr>
-        <w:pStyle w:val="ListParagraph"/>
+        <w:pStyle w:val="a3"/>
         <w:spacing w:before="100" w:beforeAutospacing="1" w:after="100" w:afterAutospacing="1"/>
         <w:rPr>
           <w:rFonts w:ascii="Times New Roman" w:eastAsia="Times New Roman" w:hAnsi="Times New Roman" w:cs="Times New Roman"/>
@@ -1303,7 +1571,7 @@
     </w:p>
     <w:p>
       <w:pPr>
-        <w:pStyle w:val="ListParagraph"/>
+        <w:pStyle w:val="a3"/>
         <w:spacing w:before="100" w:beforeAutospacing="1" w:after="100" w:afterAutospacing="1"/>
         <w:rPr>
           <w:rFonts w:ascii="Times New Roman" w:eastAsia="Times New Roman" w:hAnsi="Times New Roman" w:cs="Times New Roman"/>
@@ -1312,7 +1580,7 @@
     </w:p>
     <w:p>
       <w:pPr>
-        <w:pStyle w:val="ListParagraph"/>
+        <w:pStyle w:val="a3"/>
         <w:spacing w:before="100" w:beforeAutospacing="1" w:after="100" w:afterAutospacing="1"/>
         <w:rPr>
           <w:rFonts w:ascii="Times New Roman" w:eastAsia="Times New Roman" w:hAnsi="Times New Roman" w:cs="Times New Roman"/>
@@ -1321,7 +1589,7 @@
     </w:p>
     <w:p>
       <w:pPr>
-        <w:pStyle w:val="ListParagraph"/>
+        <w:pStyle w:val="a3"/>
         <w:numPr>
           <w:ilvl w:val="0"/>
           <w:numId w:val="1"/>
@@ -1391,6 +1659,7 @@
           <w:rFonts w:hint="eastAsia"/>
           <w:noProof/>
         </w:rPr>
+        <w:lastRenderedPageBreak/>
         <w:drawing>
           <wp:inline distT="0" distB="0" distL="0" distR="0" wp14:anchorId="639538BF" wp14:editId="6EAEDB1D">
             <wp:extent cx="3925185" cy="1110878"/>
@@ -1439,7 +1708,6 @@
         <w:rPr>
           <w:rFonts w:hint="eastAsia"/>
         </w:rPr>
-        <w:lastRenderedPageBreak/>
         <w:t xml:space="preserve">         </w:t>
       </w:r>
       <w:r>
@@ -1731,7 +1999,6 @@
     <w:p>
       <w:pPr>
         <w:rPr>
-          <w:rFonts w:hint="eastAsia"/>
           <w:color w:val="FF0000"/>
         </w:rPr>
       </w:pPr>
@@ -1932,23 +2199,45 @@
         <w:t>位不变</w:t>
       </w:r>
     </w:p>
-    <w:p/>
-    <w:p/>
-    <w:p/>
-    <w:p>
-      <w:pPr>
-        <w:pStyle w:val="ListParagraph"/>
+    <w:p>
+      <w:pPr>
+        <w:rPr>
+          <w:rFonts w:hint="eastAsia"/>
+          <w:color w:val="FF0000"/>
+        </w:rPr>
+      </w:pPr>
+    </w:p>
+    <w:p>
+      <w:pPr>
+        <w:pStyle w:val="a3"/>
         <w:numPr>
           <w:ilvl w:val="0"/>
           <w:numId w:val="1"/>
         </w:numPr>
         <w:ind w:left="0" w:firstLine="360"/>
-      </w:pPr>
-      <w:r>
-        <w:rPr>
-          <w:rFonts w:hint="eastAsia"/>
-        </w:rPr>
-        <w:t>请求分页管理系统中，假设某进程的页表内容如下表所示。页面大小为</w:t>
+        <w:rPr>
+          <w:rFonts w:hint="eastAsia"/>
+        </w:rPr>
+      </w:pPr>
+      <w:r>
+        <w:rPr>
+          <w:rFonts w:hint="eastAsia"/>
+        </w:rPr>
+        <w:t>请求分页管理系统中，假设</w:t>
+      </w:r>
+      <w:proofErr w:type="gramStart"/>
+      <w:r>
+        <w:rPr>
+          <w:rFonts w:hint="eastAsia"/>
+        </w:rPr>
+        <w:t>某进程</w:t>
+      </w:r>
+      <w:proofErr w:type="gramEnd"/>
+      <w:r>
+        <w:rPr>
+          <w:rFonts w:hint="eastAsia"/>
+        </w:rPr>
+        <w:t>的页表内容如下表所示。页面大小为</w:t>
       </w:r>
       <w:r>
         <w:rPr>
@@ -2181,12 +2470,7 @@
     </w:p>
     <w:p>
       <w:pPr>
-        <w:pStyle w:val="ListParagraph"/>
-      </w:pPr>
-    </w:p>
-    <w:p>
-      <w:pPr>
-        <w:pStyle w:val="ListParagraph"/>
+        <w:pStyle w:val="a3"/>
         <w:ind w:left="0" w:firstLine="380"/>
       </w:pPr>
       <w:r>
@@ -2306,15 +2590,18 @@
     </w:p>
     <w:p>
       <w:pPr>
-        <w:pStyle w:val="ListParagraph"/>
+        <w:pStyle w:val="a3"/>
         <w:ind w:left="380"/>
       </w:pPr>
     </w:p>
     <w:p>
       <w:pPr>
-        <w:pStyle w:val="ListParagraph"/>
+        <w:pStyle w:val="a3"/>
         <w:ind w:left="380"/>
         <w:jc w:val="center"/>
+        <w:rPr>
+          <w:rFonts w:hint="eastAsia"/>
+        </w:rPr>
       </w:pPr>
       <w:r>
         <w:rPr>
@@ -2366,118 +2653,709 @@
     </w:p>
     <w:p>
       <w:pPr>
-        <w:pStyle w:val="ListParagraph"/>
+        <w:pStyle w:val="a3"/>
         <w:ind w:left="380"/>
-        <w:jc w:val="center"/>
-      </w:pPr>
-    </w:p>
-    <w:p>
-      <w:pPr>
-        <w:pStyle w:val="ListParagraph"/>
+        <w:rPr>
+          <w:color w:val="FF0000"/>
+        </w:rPr>
+      </w:pPr>
+      <w:r>
+        <w:rPr>
+          <w:rFonts w:hint="eastAsia"/>
+          <w:color w:val="FF0000"/>
+        </w:rPr>
+        <w:t>1)</w:t>
+      </w:r>
+      <w:r>
+        <w:rPr>
+          <w:rFonts w:hint="eastAsia"/>
+          <w:color w:val="FF0000"/>
+        </w:rPr>
+        <w:t>由于页面大小为</w:t>
+      </w:r>
+      <w:r>
+        <w:rPr>
+          <w:rFonts w:hint="eastAsia"/>
+          <w:color w:val="FF0000"/>
+        </w:rPr>
+        <w:t>4KB=2</w:t>
+      </w:r>
+      <w:r>
+        <w:rPr>
+          <w:rFonts w:hint="eastAsia"/>
+          <w:color w:val="FF0000"/>
+          <w:vertAlign w:val="superscript"/>
+        </w:rPr>
+        <w:t>12</w:t>
+      </w:r>
+      <w:r>
+        <w:rPr>
+          <w:rFonts w:hint="eastAsia"/>
+          <w:color w:val="FF0000"/>
+        </w:rPr>
+        <w:t>KB</w:t>
+      </w:r>
+      <w:r>
+        <w:rPr>
+          <w:rFonts w:hint="eastAsia"/>
+          <w:color w:val="FF0000"/>
+        </w:rPr>
+        <w:t>，故逻辑地址末尾</w:t>
+      </w:r>
+      <w:r>
+        <w:rPr>
+          <w:rFonts w:hint="eastAsia"/>
+          <w:color w:val="FF0000"/>
+        </w:rPr>
+        <w:t>12</w:t>
+      </w:r>
+      <w:r>
+        <w:rPr>
+          <w:rFonts w:hint="eastAsia"/>
+          <w:color w:val="FF0000"/>
+        </w:rPr>
+        <w:t>位表示页内偏移</w:t>
+      </w:r>
+      <w:r>
+        <w:rPr>
+          <w:rFonts w:hint="eastAsia"/>
+          <w:color w:val="FF0000"/>
+        </w:rPr>
+        <w:t>W</w:t>
+      </w:r>
+      <w:r>
+        <w:rPr>
+          <w:rFonts w:hint="eastAsia"/>
+          <w:color w:val="FF0000"/>
+        </w:rPr>
+        <w:t>，前</w:t>
+      </w:r>
+      <w:r>
+        <w:rPr>
+          <w:rFonts w:hint="eastAsia"/>
+          <w:color w:val="FF0000"/>
+        </w:rPr>
+        <w:t>4</w:t>
+      </w:r>
+      <w:r>
+        <w:rPr>
+          <w:rFonts w:hint="eastAsia"/>
+          <w:color w:val="FF0000"/>
+        </w:rPr>
+        <w:t>位表示页号</w:t>
+      </w:r>
+      <w:r>
+        <w:rPr>
+          <w:rFonts w:hint="eastAsia"/>
+          <w:color w:val="FF0000"/>
+        </w:rPr>
+        <w:t>P</w:t>
+      </w:r>
+      <w:r>
+        <w:rPr>
+          <w:rFonts w:hint="eastAsia"/>
+          <w:color w:val="FF0000"/>
+        </w:rPr>
+        <w:t>。</w:t>
+      </w:r>
+      <w:r>
+        <w:rPr>
+          <w:rFonts w:hint="eastAsia"/>
+          <w:color w:val="FF0000"/>
+        </w:rPr>
+        <w:t xml:space="preserve"> </w:t>
+      </w:r>
+      <w:r>
+        <w:rPr>
+          <w:rFonts w:hint="eastAsia"/>
+          <w:color w:val="FF0000"/>
+        </w:rPr>
+        <w:t>设访问内存时间为</w:t>
+      </w:r>
+      <w:r>
+        <w:rPr>
+          <w:rFonts w:hint="eastAsia"/>
+          <w:color w:val="FF0000"/>
+        </w:rPr>
+        <w:t>t</w:t>
+      </w:r>
+      <w:r>
+        <w:rPr>
+          <w:rFonts w:hint="eastAsia"/>
+          <w:color w:val="FF0000"/>
+        </w:rPr>
+        <w:t>，查找快表时间为</w:t>
+      </w:r>
+      <w:r>
+        <w:rPr>
+          <w:rFonts w:hint="eastAsia"/>
+          <w:color w:val="FF0000"/>
+        </w:rPr>
+        <w:t>a</w:t>
+      </w:r>
+      <w:r>
+        <w:rPr>
+          <w:rFonts w:hint="eastAsia"/>
+          <w:color w:val="FF0000"/>
+        </w:rPr>
+        <w:t>，处理缺页中断的时间为</w:t>
+      </w:r>
+      <w:r>
+        <w:rPr>
+          <w:rFonts w:hint="eastAsia"/>
+          <w:color w:val="FF0000"/>
+        </w:rPr>
+        <w:t>T</w:t>
+      </w:r>
+      <w:r>
+        <w:rPr>
+          <w:rFonts w:hint="eastAsia"/>
+          <w:color w:val="FF0000"/>
+        </w:rPr>
+        <w:t>。</w:t>
+      </w:r>
+    </w:p>
+    <w:p>
+      <w:pPr>
+        <w:pStyle w:val="a3"/>
         <w:ind w:left="380"/>
-        <w:jc w:val="center"/>
-      </w:pPr>
-    </w:p>
-    <w:p>
-      <w:pPr>
-        <w:pStyle w:val="ListParagraph"/>
+        <w:rPr>
+          <w:color w:val="FF0000"/>
+        </w:rPr>
+      </w:pPr>
+    </w:p>
+    <w:p>
+      <w:pPr>
+        <w:pStyle w:val="a3"/>
         <w:ind w:left="380"/>
         <w:rPr>
-          <w:rFonts w:hint="eastAsia"/>
-          <w:color w:val="FF0000"/>
-        </w:rPr>
-      </w:pPr>
-      <w:r>
-        <w:rPr>
-          <w:rFonts w:hint="eastAsia"/>
-          <w:color w:val="FF0000"/>
-        </w:rPr>
-        <w:t>1)</w:t>
-      </w:r>
-      <w:r>
-        <w:rPr>
-          <w:rFonts w:hint="eastAsia"/>
-          <w:color w:val="FF0000"/>
-        </w:rPr>
-        <w:t>由于页面大小为</w:t>
-      </w:r>
-      <w:r>
-        <w:rPr>
-          <w:rFonts w:hint="eastAsia"/>
-          <w:color w:val="FF0000"/>
-        </w:rPr>
-        <w:t>4KB=2</w:t>
-      </w:r>
-      <w:r>
-        <w:rPr>
-          <w:rFonts w:hint="eastAsia"/>
-          <w:color w:val="FF0000"/>
-          <w:vertAlign w:val="superscript"/>
-        </w:rPr>
-        <w:t>12</w:t>
-      </w:r>
-      <w:r>
-        <w:rPr>
-          <w:rFonts w:hint="eastAsia"/>
-          <w:color w:val="FF0000"/>
-        </w:rPr>
-        <w:t>KB</w:t>
-      </w:r>
-      <w:r>
-        <w:rPr>
-          <w:rFonts w:hint="eastAsia"/>
-          <w:color w:val="FF0000"/>
-        </w:rPr>
-        <w:t>，故逻辑地址末尾</w:t>
-      </w:r>
-      <w:r>
-        <w:rPr>
-          <w:rFonts w:hint="eastAsia"/>
-          <w:color w:val="FF0000"/>
-        </w:rPr>
-        <w:t>12</w:t>
-      </w:r>
-      <w:r>
-        <w:rPr>
-          <w:rFonts w:hint="eastAsia"/>
-          <w:color w:val="FF0000"/>
-        </w:rPr>
-        <w:t>位表示页内偏移</w:t>
-      </w:r>
-      <w:r>
-        <w:rPr>
-          <w:rFonts w:hint="eastAsia"/>
-          <w:color w:val="FF0000"/>
-        </w:rPr>
-        <w:t>W</w:t>
-      </w:r>
-      <w:r>
-        <w:rPr>
-          <w:rFonts w:hint="eastAsia"/>
-          <w:color w:val="FF0000"/>
-        </w:rPr>
-        <w:t>，前</w:t>
-      </w:r>
-      <w:r>
-        <w:rPr>
-          <w:rFonts w:hint="eastAsia"/>
-          <w:color w:val="FF0000"/>
-        </w:rPr>
-        <w:t>4</w:t>
-      </w:r>
-      <w:r>
-        <w:rPr>
-          <w:rFonts w:hint="eastAsia"/>
-          <w:color w:val="FF0000"/>
-        </w:rPr>
-        <w:t>位表示页号</w:t>
-      </w:r>
-      <w:r>
-        <w:rPr>
-          <w:rFonts w:hint="eastAsia"/>
-          <w:color w:val="FF0000"/>
-        </w:rPr>
-        <w:t>P</w:t>
+          <w:color w:val="FF0000"/>
+        </w:rPr>
+      </w:pPr>
+      <w:r>
+        <w:rPr>
+          <w:rFonts w:hint="eastAsia"/>
+          <w:color w:val="FF0000"/>
+        </w:rPr>
+        <w:t>对于逻辑地址</w:t>
+      </w:r>
+      <w:r>
+        <w:rPr>
+          <w:rFonts w:hint="eastAsia"/>
+          <w:color w:val="FF0000"/>
+        </w:rPr>
+        <w:t>2362H</w:t>
+      </w:r>
+      <w:r>
+        <w:rPr>
+          <w:rFonts w:hint="eastAsia"/>
+          <w:color w:val="FF0000"/>
+        </w:rPr>
+        <w:t>，其表示的页号为</w:t>
+      </w:r>
+      <w:r>
+        <w:rPr>
+          <w:rFonts w:hint="eastAsia"/>
+          <w:color w:val="FF0000"/>
+        </w:rPr>
+        <w:t>2</w:t>
+      </w:r>
+      <w:r>
+        <w:rPr>
+          <w:rFonts w:hint="eastAsia"/>
+          <w:color w:val="FF0000"/>
+        </w:rPr>
+        <w:t>，访问次序依次为：访问</w:t>
+      </w:r>
+      <w:r>
+        <w:rPr>
+          <w:rFonts w:hint="eastAsia"/>
+          <w:color w:val="FF0000"/>
+        </w:rPr>
+        <w:t>TLB</w:t>
+      </w:r>
+      <w:r>
+        <w:rPr>
+          <w:rFonts w:hint="eastAsia"/>
+          <w:color w:val="FF0000"/>
+        </w:rPr>
+        <w:t>未命中</w:t>
+      </w:r>
+      <w:r>
+        <w:rPr>
+          <w:rFonts w:hint="eastAsia"/>
+          <w:color w:val="FF0000"/>
+        </w:rPr>
+        <w:t>(10ns)</w:t>
+      </w:r>
+      <w:r>
+        <w:rPr>
+          <w:rFonts w:hint="eastAsia"/>
+          <w:color w:val="FF0000"/>
+        </w:rPr>
+        <w:t>；</w:t>
+      </w:r>
+      <w:r>
+        <w:rPr>
+          <w:rFonts w:hint="eastAsia"/>
+          <w:color w:val="FF0000"/>
+        </w:rPr>
+        <w:t xml:space="preserve"> </w:t>
+      </w:r>
+      <w:r>
+        <w:rPr>
+          <w:rFonts w:hint="eastAsia"/>
+          <w:color w:val="FF0000"/>
+        </w:rPr>
+        <w:t>访问页表命中</w:t>
+      </w:r>
+      <w:r>
+        <w:rPr>
+          <w:rFonts w:hint="eastAsia"/>
+          <w:color w:val="FF0000"/>
+        </w:rPr>
+        <w:t>2</w:t>
+      </w:r>
+      <w:r>
+        <w:rPr>
+          <w:rFonts w:hint="eastAsia"/>
+          <w:color w:val="FF0000"/>
+        </w:rPr>
+        <w:t>号页面，并将页表项副本放入</w:t>
+      </w:r>
+      <w:r>
+        <w:rPr>
+          <w:rFonts w:hint="eastAsia"/>
+          <w:color w:val="FF0000"/>
+        </w:rPr>
+        <w:t>TLB</w:t>
+      </w:r>
+      <w:r>
+        <w:rPr>
+          <w:rFonts w:hint="eastAsia"/>
+          <w:color w:val="FF0000"/>
+        </w:rPr>
+        <w:t>（</w:t>
+      </w:r>
+      <w:r>
+        <w:rPr>
+          <w:rFonts w:hint="eastAsia"/>
+          <w:color w:val="FF0000"/>
+        </w:rPr>
+        <w:t>100ns</w:t>
+      </w:r>
+      <w:r>
+        <w:rPr>
+          <w:rFonts w:hint="eastAsia"/>
+          <w:color w:val="FF0000"/>
+        </w:rPr>
+        <w:t>）</w:t>
+      </w:r>
+      <w:r>
+        <w:rPr>
+          <w:rFonts w:hint="eastAsia"/>
+          <w:color w:val="FF0000"/>
+        </w:rPr>
+        <w:t>,</w:t>
+      </w:r>
+      <w:r>
+        <w:rPr>
+          <w:rFonts w:hint="eastAsia"/>
+          <w:color w:val="FF0000"/>
+        </w:rPr>
+        <w:t>得到物理地址，访问内存（</w:t>
+      </w:r>
+      <w:r>
+        <w:rPr>
+          <w:rFonts w:hint="eastAsia"/>
+          <w:color w:val="FF0000"/>
+        </w:rPr>
+        <w:t>100ns</w:t>
+      </w:r>
+      <w:r>
+        <w:rPr>
+          <w:rFonts w:hint="eastAsia"/>
+          <w:color w:val="FF0000"/>
+        </w:rPr>
+        <w:t>）。</w:t>
+      </w:r>
+    </w:p>
+    <w:p>
+      <w:pPr>
+        <w:pStyle w:val="a3"/>
+        <w:ind w:left="380"/>
+        <w:rPr>
+          <w:color w:val="FF0000"/>
+        </w:rPr>
+      </w:pPr>
+    </w:p>
+    <w:p>
+      <w:pPr>
+        <w:pStyle w:val="a3"/>
+        <w:ind w:left="380"/>
+        <w:rPr>
+          <w:color w:val="FF0000"/>
+        </w:rPr>
+      </w:pPr>
+      <w:r>
+        <w:rPr>
+          <w:rFonts w:hint="eastAsia"/>
+          <w:color w:val="FF0000"/>
+        </w:rPr>
+        <w:t>故逻辑地址</w:t>
+      </w:r>
+      <w:r>
+        <w:rPr>
+          <w:rFonts w:hint="eastAsia"/>
+          <w:color w:val="FF0000"/>
+        </w:rPr>
+        <w:t>2362H</w:t>
+      </w:r>
+      <w:r>
+        <w:rPr>
+          <w:rFonts w:hint="eastAsia"/>
+          <w:color w:val="FF0000"/>
+        </w:rPr>
+        <w:t>的访问时间为：</w:t>
+      </w:r>
+      <w:r>
+        <w:rPr>
+          <w:rFonts w:hint="eastAsia"/>
+          <w:color w:val="FF0000"/>
+        </w:rPr>
+        <w:t>EAT=</w:t>
+      </w:r>
+      <w:proofErr w:type="spellStart"/>
+      <w:r>
+        <w:rPr>
+          <w:rFonts w:hint="eastAsia"/>
+          <w:color w:val="FF0000"/>
+        </w:rPr>
+        <w:t>a+t+t</w:t>
+      </w:r>
+      <w:proofErr w:type="spellEnd"/>
+      <w:r>
+        <w:rPr>
+          <w:rFonts w:hint="eastAsia"/>
+          <w:color w:val="FF0000"/>
+        </w:rPr>
+        <w:t>=10+100+100=210ns;</w:t>
+      </w:r>
+    </w:p>
+    <w:p>
+      <w:pPr>
+        <w:pStyle w:val="a3"/>
+        <w:ind w:left="380"/>
+        <w:rPr>
+          <w:color w:val="FF0000"/>
+        </w:rPr>
+      </w:pPr>
+    </w:p>
+    <w:p>
+      <w:pPr>
+        <w:pStyle w:val="a3"/>
+        <w:ind w:left="380"/>
+        <w:rPr>
+          <w:color w:val="FF0000"/>
+        </w:rPr>
+      </w:pPr>
+      <w:r>
+        <w:rPr>
+          <w:rFonts w:hint="eastAsia"/>
+          <w:color w:val="FF0000"/>
+        </w:rPr>
+        <w:lastRenderedPageBreak/>
+        <w:t>对于逻辑地址</w:t>
+      </w:r>
+      <w:r>
+        <w:rPr>
+          <w:rFonts w:hint="eastAsia"/>
+          <w:color w:val="FF0000"/>
+        </w:rPr>
+        <w:t>1565H</w:t>
+      </w:r>
+      <w:r>
+        <w:rPr>
+          <w:rFonts w:hint="eastAsia"/>
+          <w:color w:val="FF0000"/>
+        </w:rPr>
+        <w:t>，其表示的页号为</w:t>
+      </w:r>
+      <w:r>
+        <w:rPr>
+          <w:rFonts w:hint="eastAsia"/>
+          <w:color w:val="FF0000"/>
+        </w:rPr>
+        <w:t>1</w:t>
+      </w:r>
+      <w:r>
+        <w:rPr>
+          <w:rFonts w:hint="eastAsia"/>
+          <w:color w:val="FF0000"/>
+        </w:rPr>
+        <w:t>，访问次序依次为，访问</w:t>
+      </w:r>
+      <w:r>
+        <w:rPr>
+          <w:rFonts w:hint="eastAsia"/>
+          <w:color w:val="FF0000"/>
+        </w:rPr>
+        <w:t>TLB</w:t>
+      </w:r>
+      <w:r>
+        <w:rPr>
+          <w:rFonts w:hint="eastAsia"/>
+          <w:color w:val="FF0000"/>
+        </w:rPr>
+        <w:t>未命中</w:t>
+      </w:r>
+      <w:r>
+        <w:rPr>
+          <w:rFonts w:hint="eastAsia"/>
+          <w:color w:val="FF0000"/>
+        </w:rPr>
+        <w:t>(10ns)</w:t>
+      </w:r>
+      <w:r>
+        <w:rPr>
+          <w:rFonts w:hint="eastAsia"/>
+          <w:color w:val="FF0000"/>
+        </w:rPr>
+        <w:t>；访问页表未命中</w:t>
+      </w:r>
+      <w:r>
+        <w:rPr>
+          <w:rFonts w:hint="eastAsia"/>
+          <w:color w:val="FF0000"/>
+        </w:rPr>
+        <w:t>(100ns)</w:t>
+      </w:r>
+      <w:r>
+        <w:rPr>
+          <w:rFonts w:hint="eastAsia"/>
+          <w:color w:val="FF0000"/>
+        </w:rPr>
+        <w:t>；发生缺页中断</w:t>
+      </w:r>
+      <w:r>
+        <w:rPr>
+          <w:rFonts w:hint="eastAsia"/>
+          <w:color w:val="FF0000"/>
+        </w:rPr>
+        <w:t>(108ns)</w:t>
+      </w:r>
+      <w:r>
+        <w:rPr>
+          <w:rFonts w:hint="eastAsia"/>
+          <w:color w:val="FF0000"/>
+        </w:rPr>
+        <w:t>；访问</w:t>
+      </w:r>
+      <w:r>
+        <w:rPr>
+          <w:rFonts w:hint="eastAsia"/>
+          <w:color w:val="FF0000"/>
+        </w:rPr>
+        <w:t>TLB</w:t>
+      </w:r>
+      <w:r>
+        <w:rPr>
+          <w:rFonts w:hint="eastAsia"/>
+          <w:color w:val="FF0000"/>
+        </w:rPr>
+        <w:t>命中</w:t>
+      </w:r>
+      <w:r>
+        <w:rPr>
+          <w:rFonts w:hint="eastAsia"/>
+          <w:color w:val="FF0000"/>
+        </w:rPr>
+        <w:t>1</w:t>
+      </w:r>
+      <w:r>
+        <w:rPr>
+          <w:rFonts w:hint="eastAsia"/>
+          <w:color w:val="FF0000"/>
+        </w:rPr>
+        <w:t>号页面</w:t>
+      </w:r>
+      <w:r>
+        <w:rPr>
+          <w:rFonts w:hint="eastAsia"/>
+          <w:color w:val="FF0000"/>
+        </w:rPr>
+        <w:t>(10ns)</w:t>
+      </w:r>
+      <w:r>
+        <w:rPr>
+          <w:rFonts w:hint="eastAsia"/>
+          <w:color w:val="FF0000"/>
+        </w:rPr>
+        <w:t>；得到物理地址访问内存</w:t>
+      </w:r>
+      <w:r>
+        <w:rPr>
+          <w:rFonts w:hint="eastAsia"/>
+          <w:color w:val="FF0000"/>
+        </w:rPr>
+        <w:t>(100ns)</w:t>
+      </w:r>
+      <w:r>
+        <w:rPr>
+          <w:rFonts w:hint="eastAsia"/>
+          <w:color w:val="FF0000"/>
+        </w:rPr>
+        <w:t>。此时驻留集已满</w:t>
+      </w:r>
+      <w:r>
+        <w:rPr>
+          <w:rFonts w:hint="eastAsia"/>
+          <w:color w:val="FF0000"/>
+        </w:rPr>
+        <w:t>(0</w:t>
+      </w:r>
+      <w:r>
+        <w:rPr>
+          <w:rFonts w:hint="eastAsia"/>
+          <w:color w:val="FF0000"/>
+        </w:rPr>
+        <w:t>号页面和</w:t>
+      </w:r>
+      <w:r>
+        <w:rPr>
+          <w:rFonts w:hint="eastAsia"/>
+          <w:color w:val="FF0000"/>
+        </w:rPr>
+        <w:t>2</w:t>
+      </w:r>
+      <w:r>
+        <w:rPr>
+          <w:rFonts w:hint="eastAsia"/>
+          <w:color w:val="FF0000"/>
+        </w:rPr>
+        <w:t>号页面</w:t>
+      </w:r>
+      <w:r>
+        <w:rPr>
+          <w:rFonts w:hint="eastAsia"/>
+          <w:color w:val="FF0000"/>
+        </w:rPr>
+        <w:t>)</w:t>
+      </w:r>
+    </w:p>
+    <w:p>
+      <w:pPr>
+        <w:pStyle w:val="a3"/>
+        <w:ind w:left="380"/>
+        <w:rPr>
+          <w:color w:val="FF0000"/>
+        </w:rPr>
+      </w:pPr>
+    </w:p>
+    <w:p>
+      <w:pPr>
+        <w:pStyle w:val="a3"/>
+        <w:ind w:left="380"/>
+        <w:rPr>
+          <w:color w:val="FF0000"/>
+        </w:rPr>
+      </w:pPr>
+      <w:r>
+        <w:rPr>
+          <w:rFonts w:hint="eastAsia"/>
+          <w:color w:val="FF0000"/>
+        </w:rPr>
+        <w:t>故逻辑地址</w:t>
+      </w:r>
+      <w:r>
+        <w:rPr>
+          <w:rFonts w:hint="eastAsia"/>
+          <w:color w:val="FF0000"/>
+        </w:rPr>
+        <w:t>1565H</w:t>
+      </w:r>
+      <w:r>
+        <w:rPr>
+          <w:rFonts w:hint="eastAsia"/>
+          <w:color w:val="FF0000"/>
+        </w:rPr>
+        <w:t>的访问时间为：</w:t>
+      </w:r>
+    </w:p>
+    <w:p>
+      <w:pPr>
+        <w:pStyle w:val="a3"/>
+        <w:ind w:left="380"/>
+        <w:rPr>
+          <w:color w:val="FF0000"/>
+        </w:rPr>
+      </w:pPr>
+      <w:r>
+        <w:rPr>
+          <w:rFonts w:hint="eastAsia"/>
+          <w:color w:val="FF0000"/>
+        </w:rPr>
+        <w:t>EAT=</w:t>
+      </w:r>
+      <w:proofErr w:type="spellStart"/>
+      <w:r>
+        <w:rPr>
+          <w:rFonts w:hint="eastAsia"/>
+          <w:color w:val="FF0000"/>
+        </w:rPr>
+        <w:t>a+t+T+a+t</w:t>
+      </w:r>
+      <w:proofErr w:type="spellEnd"/>
+      <w:r>
+        <w:rPr>
+          <w:rFonts w:hint="eastAsia"/>
+          <w:color w:val="FF0000"/>
+        </w:rPr>
+        <w:t>=T+2</w:t>
+      </w:r>
+      <w:r>
+        <w:rPr>
+          <w:rFonts w:hint="eastAsia"/>
+          <w:color w:val="FF0000"/>
+        </w:rPr>
+        <w:t>×</w:t>
+      </w:r>
+      <w:r>
+        <w:rPr>
+          <w:rFonts w:hint="eastAsia"/>
+          <w:color w:val="FF0000"/>
+        </w:rPr>
+        <w:t>(</w:t>
+      </w:r>
+      <w:proofErr w:type="spellStart"/>
+      <w:r>
+        <w:rPr>
+          <w:rFonts w:hint="eastAsia"/>
+          <w:color w:val="FF0000"/>
+        </w:rPr>
+        <w:t>a+t</w:t>
+      </w:r>
+      <w:proofErr w:type="spellEnd"/>
+      <w:r>
+        <w:rPr>
+          <w:rFonts w:hint="eastAsia"/>
+          <w:color w:val="FF0000"/>
+        </w:rPr>
+        <w:t>)=108+2</w:t>
+      </w:r>
+      <w:r>
+        <w:rPr>
+          <w:rFonts w:hint="eastAsia"/>
+          <w:color w:val="FF0000"/>
+        </w:rPr>
+        <w:t>×</w:t>
+      </w:r>
+      <w:r>
+        <w:rPr>
+          <w:rFonts w:hint="eastAsia"/>
+          <w:color w:val="FF0000"/>
+        </w:rPr>
+        <w:t>(100+10)=100000220ns</w:t>
       </w:r>
       <w:r>
         <w:rPr>
@@ -2486,54 +3364,93 @@
         </w:rPr>
         <w:t>。</w:t>
       </w:r>
-      <w:r>
-        <w:rPr>
-          <w:rFonts w:hint="eastAsia"/>
-          <w:color w:val="FF0000"/>
-        </w:rPr>
-        <w:t xml:space="preserve"> </w:t>
-      </w:r>
-      <w:r>
-        <w:rPr>
-          <w:rFonts w:hint="eastAsia"/>
-          <w:color w:val="FF0000"/>
-        </w:rPr>
-        <w:t>设访问内存时间为</w:t>
-      </w:r>
-      <w:r>
-        <w:rPr>
-          <w:rFonts w:hint="eastAsia"/>
-          <w:color w:val="FF0000"/>
-        </w:rPr>
-        <w:t>t</w:t>
-      </w:r>
-      <w:r>
-        <w:rPr>
-          <w:rFonts w:hint="eastAsia"/>
-          <w:color w:val="FF0000"/>
-        </w:rPr>
-        <w:t>，查找快表时间为</w:t>
-      </w:r>
-      <w:r>
-        <w:rPr>
-          <w:rFonts w:hint="eastAsia"/>
-          <w:color w:val="FF0000"/>
-        </w:rPr>
-        <w:t>a</w:t>
-      </w:r>
-      <w:r>
-        <w:rPr>
-          <w:rFonts w:hint="eastAsia"/>
-          <w:color w:val="FF0000"/>
-        </w:rPr>
-        <w:t>，处理缺页中断的时间为</w:t>
-      </w:r>
-      <w:r>
-        <w:rPr>
-          <w:rFonts w:hint="eastAsia"/>
-          <w:color w:val="FF0000"/>
-        </w:rPr>
-        <w:t>T</w:t>
+    </w:p>
+    <w:p>
+      <w:pPr>
+        <w:pStyle w:val="a3"/>
+        <w:ind w:left="380"/>
+        <w:rPr>
+          <w:color w:val="FF0000"/>
+        </w:rPr>
+      </w:pPr>
+    </w:p>
+    <w:p>
+      <w:pPr>
+        <w:pStyle w:val="a3"/>
+        <w:ind w:left="380"/>
+        <w:rPr>
+          <w:color w:val="FF0000"/>
+        </w:rPr>
+      </w:pPr>
+      <w:r>
+        <w:rPr>
+          <w:rFonts w:hint="eastAsia"/>
+          <w:color w:val="FF0000"/>
+        </w:rPr>
+        <w:t>对于逻辑地址</w:t>
+      </w:r>
+      <w:r>
+        <w:rPr>
+          <w:rFonts w:hint="eastAsia"/>
+          <w:color w:val="FF0000"/>
+        </w:rPr>
+        <w:t>25A5H</w:t>
+      </w:r>
+      <w:r>
+        <w:rPr>
+          <w:rFonts w:hint="eastAsia"/>
+          <w:color w:val="FF0000"/>
+        </w:rPr>
+        <w:t>，其表示的页号为</w:t>
+      </w:r>
+      <w:r>
+        <w:rPr>
+          <w:rFonts w:hint="eastAsia"/>
+          <w:color w:val="FF0000"/>
+        </w:rPr>
+        <w:t>2</w:t>
+      </w:r>
+      <w:r>
+        <w:rPr>
+          <w:rFonts w:hint="eastAsia"/>
+          <w:color w:val="FF0000"/>
+        </w:rPr>
+        <w:t>，访问次序依次为：访问</w:t>
+      </w:r>
+      <w:r>
+        <w:rPr>
+          <w:rFonts w:hint="eastAsia"/>
+          <w:color w:val="FF0000"/>
+        </w:rPr>
+        <w:t>TLB</w:t>
+      </w:r>
+      <w:r>
+        <w:rPr>
+          <w:rFonts w:hint="eastAsia"/>
+          <w:color w:val="FF0000"/>
+        </w:rPr>
+        <w:t>命中二号页面</w:t>
+      </w:r>
+      <w:r>
+        <w:rPr>
+          <w:rFonts w:hint="eastAsia"/>
+          <w:color w:val="FF0000"/>
+        </w:rPr>
+        <w:t>(10ns)</w:t>
+      </w:r>
+      <w:r>
+        <w:rPr>
+          <w:rFonts w:hint="eastAsia"/>
+          <w:color w:val="FF0000"/>
+        </w:rPr>
+        <w:t>；得到物理地址访问内存</w:t>
+      </w:r>
+      <w:r>
+        <w:rPr>
+          <w:rFonts w:hint="eastAsia"/>
+          <w:color w:val="FF0000"/>
+        </w:rPr>
+        <w:t>(100ns)</w:t>
       </w:r>
       <w:r>
         <w:rPr>
@@ -2545,7 +3462,7 @@
     </w:p>
     <w:p>
       <w:pPr>
-        <w:pStyle w:val="ListParagraph"/>
+        <w:pStyle w:val="a3"/>
         <w:ind w:left="380"/>
         <w:rPr>
           <w:color w:val="FF0000"/>
@@ -2554,37 +3471,76 @@
     </w:p>
     <w:p>
       <w:pPr>
-        <w:pStyle w:val="ListParagraph"/>
+        <w:pStyle w:val="a3"/>
         <w:ind w:left="380"/>
         <w:rPr>
-          <w:rFonts w:hint="eastAsia"/>
-          <w:color w:val="FF0000"/>
-        </w:rPr>
-      </w:pPr>
-      <w:r>
-        <w:rPr>
-          <w:rFonts w:hint="eastAsia"/>
-          <w:color w:val="FF0000"/>
-        </w:rPr>
-        <w:t>对于逻辑地址</w:t>
-      </w:r>
-      <w:r>
-        <w:rPr>
-          <w:rFonts w:hint="eastAsia"/>
-          <w:color w:val="FF0000"/>
-        </w:rPr>
-        <w:t>2362H</w:t>
-      </w:r>
-      <w:r>
-        <w:rPr>
-          <w:rFonts w:hint="eastAsia"/>
-          <w:color w:val="FF0000"/>
-        </w:rPr>
-        <w:t>，其表示的页号为</w:t>
-      </w:r>
-      <w:r>
-        <w:rPr>
-          <w:rFonts w:hint="eastAsia"/>
+          <w:color w:val="FF0000"/>
+        </w:rPr>
+      </w:pPr>
+      <w:r>
+        <w:rPr>
+          <w:rFonts w:hint="eastAsia"/>
+          <w:color w:val="FF0000"/>
+        </w:rPr>
+        <w:t>故逻辑地址</w:t>
+      </w:r>
+      <w:r>
+        <w:rPr>
+          <w:rFonts w:hint="eastAsia"/>
+          <w:color w:val="FF0000"/>
+        </w:rPr>
+        <w:t>25A5H</w:t>
+      </w:r>
+      <w:r>
+        <w:rPr>
+          <w:rFonts w:hint="eastAsia"/>
+          <w:color w:val="FF0000"/>
+        </w:rPr>
+        <w:t>的访问时间为</w:t>
+      </w:r>
+      <w:r>
+        <w:rPr>
+          <w:rFonts w:hint="eastAsia"/>
+          <w:color w:val="FF0000"/>
+        </w:rPr>
+        <w:t>:EAT=</w:t>
+      </w:r>
+      <w:proofErr w:type="spellStart"/>
+      <w:r>
+        <w:rPr>
+          <w:rFonts w:hint="eastAsia"/>
+          <w:color w:val="FF0000"/>
+        </w:rPr>
+        <w:t>a+t</w:t>
+      </w:r>
+      <w:proofErr w:type="spellEnd"/>
+      <w:r>
+        <w:rPr>
+          <w:rFonts w:hint="eastAsia"/>
+          <w:color w:val="FF0000"/>
+        </w:rPr>
+        <w:t>=10+100=110ns;</w:t>
+      </w:r>
+    </w:p>
+    <w:p>
+      <w:pPr>
+        <w:pStyle w:val="a3"/>
+        <w:ind w:left="380"/>
+        <w:rPr>
+          <w:color w:val="FF0000"/>
+        </w:rPr>
+      </w:pPr>
+    </w:p>
+    <w:p>
+      <w:pPr>
+        <w:pStyle w:val="a3"/>
+        <w:ind w:left="380"/>
+        <w:rPr>
+          <w:color w:val="FF0000"/>
+        </w:rPr>
+      </w:pPr>
+      <w:r>
+        <w:rPr>
           <w:color w:val="FF0000"/>
         </w:rPr>
         <w:t>2</w:t>
@@ -2594,49 +3550,42 @@
           <w:rFonts w:hint="eastAsia"/>
           <w:color w:val="FF0000"/>
         </w:rPr>
-        <w:t>，访问次序依次为：访问</w:t>
-      </w:r>
-      <w:r>
-        <w:rPr>
-          <w:rFonts w:hint="eastAsia"/>
-          <w:color w:val="FF0000"/>
-        </w:rPr>
-        <w:t>TLB</w:t>
-      </w:r>
-      <w:r>
-        <w:rPr>
-          <w:rFonts w:hint="eastAsia"/>
-          <w:color w:val="FF0000"/>
-        </w:rPr>
-        <w:t>未命中</w:t>
-      </w:r>
-      <w:r>
-        <w:rPr>
-          <w:rFonts w:hint="eastAsia"/>
-          <w:color w:val="FF0000"/>
-        </w:rPr>
-        <w:t>(10ns)</w:t>
-      </w:r>
-      <w:r>
-        <w:rPr>
-          <w:rFonts w:hint="eastAsia"/>
-          <w:color w:val="FF0000"/>
-        </w:rPr>
-        <w:t>；</w:t>
-      </w:r>
-      <w:r>
-        <w:rPr>
-          <w:rFonts w:hint="eastAsia"/>
-          <w:color w:val="FF0000"/>
-        </w:rPr>
-        <w:t xml:space="preserve"> </w:t>
-      </w:r>
-      <w:r>
-        <w:rPr>
-          <w:rFonts w:hint="eastAsia"/>
-          <w:color w:val="FF0000"/>
-        </w:rPr>
-        <w:t>访问页表命中</w:t>
+        <w:t>)</w:t>
+      </w:r>
+      <w:r>
+        <w:rPr>
+          <w:rFonts w:hint="eastAsia"/>
+          <w:color w:val="FF0000"/>
+        </w:rPr>
+        <w:t>访问逻辑地址</w:t>
+      </w:r>
+      <w:r>
+        <w:rPr>
+          <w:rFonts w:hint="eastAsia"/>
+          <w:color w:val="FF0000"/>
+        </w:rPr>
+        <w:t>1565H</w:t>
+      </w:r>
+      <w:r>
+        <w:rPr>
+          <w:rFonts w:hint="eastAsia"/>
+          <w:color w:val="FF0000"/>
+        </w:rPr>
+        <w:t>时由于驻留集已满</w:t>
+      </w:r>
+      <w:r>
+        <w:rPr>
+          <w:rFonts w:hint="eastAsia"/>
+          <w:color w:val="FF0000"/>
+        </w:rPr>
+        <w:t>(0</w:t>
+      </w:r>
+      <w:r>
+        <w:rPr>
+          <w:rFonts w:hint="eastAsia"/>
+          <w:color w:val="FF0000"/>
+        </w:rPr>
+        <w:t>号页面和</w:t>
       </w:r>
       <w:r>
         <w:rPr>
@@ -2650,68 +3599,96 @@
           <w:rFonts w:hint="eastAsia"/>
           <w:color w:val="FF0000"/>
         </w:rPr>
-        <w:t>号页面，并将页表项副本放入</w:t>
-      </w:r>
-      <w:r>
-        <w:rPr>
-          <w:rFonts w:hint="eastAsia"/>
-          <w:color w:val="FF0000"/>
-        </w:rPr>
-        <w:t>TLB</w:t>
-      </w:r>
-      <w:r>
-        <w:rPr>
-          <w:rFonts w:hint="eastAsia"/>
-          <w:color w:val="FF0000"/>
-        </w:rPr>
-        <w:t>（</w:t>
-      </w:r>
-      <w:r>
-        <w:rPr>
-          <w:rFonts w:hint="eastAsia"/>
-          <w:color w:val="FF0000"/>
-        </w:rPr>
-        <w:t>100ns</w:t>
-      </w:r>
-      <w:r>
-        <w:rPr>
-          <w:rFonts w:hint="eastAsia"/>
-          <w:color w:val="FF0000"/>
-        </w:rPr>
-        <w:t>）</w:t>
-      </w:r>
-      <w:r>
-        <w:rPr>
-          <w:rFonts w:hint="eastAsia"/>
-          <w:color w:val="FF0000"/>
-        </w:rPr>
-        <w:t>,</w:t>
-      </w:r>
-      <w:r>
-        <w:rPr>
-          <w:rFonts w:hint="eastAsia"/>
-          <w:color w:val="FF0000"/>
-        </w:rPr>
-        <w:t>得到物理地址，访问内存（</w:t>
-      </w:r>
-      <w:r>
-        <w:rPr>
-          <w:rFonts w:hint="eastAsia"/>
-          <w:color w:val="FF0000"/>
-        </w:rPr>
-        <w:t>100ns</w:t>
-      </w:r>
-      <w:r>
-        <w:rPr>
-          <w:rFonts w:hint="eastAsia"/>
-          <w:color w:val="FF0000"/>
-        </w:rPr>
-        <w:t>）。</w:t>
-      </w:r>
-    </w:p>
-    <w:p>
-      <w:pPr>
-        <w:pStyle w:val="ListParagraph"/>
+        <w:t>号页面</w:t>
+      </w:r>
+      <w:r>
+        <w:rPr>
+          <w:rFonts w:hint="eastAsia"/>
+          <w:color w:val="FF0000"/>
+        </w:rPr>
+        <w:t>)</w:t>
+      </w:r>
+      <w:r>
+        <w:rPr>
+          <w:rFonts w:hint="eastAsia"/>
+          <w:color w:val="FF0000"/>
+        </w:rPr>
+        <w:t>。故应从页表中淘汰一个页面，根据</w:t>
+      </w:r>
+      <w:r>
+        <w:rPr>
+          <w:rFonts w:hint="eastAsia"/>
+          <w:color w:val="FF0000"/>
+        </w:rPr>
+        <w:t>LRU</w:t>
+      </w:r>
+      <w:r>
+        <w:rPr>
+          <w:rFonts w:hint="eastAsia"/>
+          <w:color w:val="FF0000"/>
+        </w:rPr>
+        <w:t>算法，</w:t>
+      </w:r>
+      <w:r>
+        <w:rPr>
+          <w:rFonts w:hint="eastAsia"/>
+          <w:color w:val="FF0000"/>
+        </w:rPr>
+        <w:t>2</w:t>
+      </w:r>
+      <w:r>
+        <w:rPr>
+          <w:rFonts w:hint="eastAsia"/>
+          <w:color w:val="FF0000"/>
+        </w:rPr>
+        <w:t>号页面刚被使用过，故淘汰</w:t>
+      </w:r>
+      <w:r>
+        <w:rPr>
+          <w:rFonts w:hint="eastAsia"/>
+          <w:color w:val="FF0000"/>
+        </w:rPr>
+        <w:t>0</w:t>
+      </w:r>
+      <w:r>
+        <w:rPr>
+          <w:rFonts w:hint="eastAsia"/>
+          <w:color w:val="FF0000"/>
+        </w:rPr>
+        <w:t>号页面，将</w:t>
+      </w:r>
+      <w:r>
+        <w:rPr>
+          <w:rFonts w:hint="eastAsia"/>
+          <w:color w:val="FF0000"/>
+        </w:rPr>
+        <w:t>1</w:t>
+      </w:r>
+      <w:r>
+        <w:rPr>
+          <w:rFonts w:hint="eastAsia"/>
+          <w:color w:val="FF0000"/>
+        </w:rPr>
+        <w:t>号页面调入获得内存块号</w:t>
+      </w:r>
+      <w:r>
+        <w:rPr>
+          <w:rFonts w:hint="eastAsia"/>
+          <w:color w:val="FF0000"/>
+        </w:rPr>
+        <w:t>101H</w:t>
+      </w:r>
+      <w:r>
+        <w:rPr>
+          <w:rFonts w:hint="eastAsia"/>
+          <w:color w:val="FF0000"/>
+        </w:rPr>
+        <w:t>。</w:t>
+      </w:r>
+    </w:p>
+    <w:p>
+      <w:pPr>
+        <w:pStyle w:val="a3"/>
         <w:ind w:left="380"/>
         <w:rPr>
           <w:color w:val="FF0000"/>
@@ -2720,373 +3697,42 @@
     </w:p>
     <w:p>
       <w:pPr>
-        <w:pStyle w:val="ListParagraph"/>
+        <w:pStyle w:val="a3"/>
         <w:ind w:left="380"/>
         <w:rPr>
-          <w:color w:val="FF0000"/>
-        </w:rPr>
-      </w:pPr>
-      <w:r>
-        <w:rPr>
-          <w:rFonts w:hint="eastAsia"/>
-          <w:color w:val="FF0000"/>
-        </w:rPr>
-        <w:t>故逻辑地址</w:t>
-      </w:r>
-      <w:r>
-        <w:rPr>
-          <w:rFonts w:hint="eastAsia"/>
-          <w:color w:val="FF0000"/>
-        </w:rPr>
-        <w:t>2362H</w:t>
-      </w:r>
-      <w:r>
-        <w:rPr>
-          <w:rFonts w:hint="eastAsia"/>
-          <w:color w:val="FF0000"/>
-        </w:rPr>
-        <w:t>的访问时间为：</w:t>
-      </w:r>
-      <w:r>
-        <w:rPr>
-          <w:rFonts w:hint="eastAsia"/>
-          <w:color w:val="FF0000"/>
-        </w:rPr>
-        <w:t>EAT=</w:t>
-      </w:r>
-      <w:proofErr w:type="spellStart"/>
-      <w:r>
-        <w:rPr>
-          <w:rFonts w:hint="eastAsia"/>
-          <w:color w:val="FF0000"/>
-        </w:rPr>
-        <w:t>a+t+t</w:t>
-      </w:r>
-      <w:proofErr w:type="spellEnd"/>
-      <w:r>
-        <w:rPr>
-          <w:rFonts w:hint="eastAsia"/>
-          <w:color w:val="FF0000"/>
-        </w:rPr>
-        <w:t>=10+100+100=210ns;</w:t>
-      </w:r>
-    </w:p>
-    <w:p>
-      <w:pPr>
-        <w:pStyle w:val="ListParagraph"/>
-        <w:ind w:left="380"/>
-        <w:rPr>
-          <w:rFonts w:hint="eastAsia"/>
-          <w:color w:val="FF0000"/>
-        </w:rPr>
-      </w:pPr>
-    </w:p>
-    <w:p>
-      <w:pPr>
-        <w:pStyle w:val="ListParagraph"/>
-        <w:ind w:left="380"/>
-        <w:rPr>
-          <w:rFonts w:hint="eastAsia"/>
-          <w:color w:val="FF0000"/>
-        </w:rPr>
-      </w:pPr>
-      <w:r>
-        <w:rPr>
-          <w:rFonts w:hint="eastAsia"/>
-          <w:color w:val="FF0000"/>
-        </w:rPr>
-        <w:t>对于逻辑地址</w:t>
-      </w:r>
-      <w:r>
-        <w:rPr>
-          <w:rFonts w:hint="eastAsia"/>
-          <w:color w:val="FF0000"/>
-        </w:rPr>
-        <w:t>1565H</w:t>
-      </w:r>
-      <w:r>
-        <w:rPr>
-          <w:rFonts w:hint="eastAsia"/>
-          <w:color w:val="FF0000"/>
-        </w:rPr>
-        <w:t>，其表示的页号为</w:t>
-      </w:r>
-      <w:r>
-        <w:rPr>
-          <w:rFonts w:hint="eastAsia"/>
-          <w:color w:val="FF0000"/>
-        </w:rPr>
-        <w:t>1</w:t>
-      </w:r>
-      <w:r>
-        <w:rPr>
-          <w:rFonts w:hint="eastAsia"/>
-          <w:color w:val="FF0000"/>
-        </w:rPr>
-        <w:t>，访问次序依次为，访问</w:t>
-      </w:r>
-      <w:r>
-        <w:rPr>
-          <w:rFonts w:hint="eastAsia"/>
-          <w:color w:val="FF0000"/>
-        </w:rPr>
-        <w:t>TLB</w:t>
-      </w:r>
-      <w:r>
-        <w:rPr>
-          <w:rFonts w:hint="eastAsia"/>
-          <w:color w:val="FF0000"/>
-        </w:rPr>
-        <w:t>未命中</w:t>
-      </w:r>
-      <w:r>
-        <w:rPr>
-          <w:rFonts w:hint="eastAsia"/>
-          <w:color w:val="FF0000"/>
-        </w:rPr>
-        <w:t>(10ns)</w:t>
-      </w:r>
-      <w:r>
-        <w:rPr>
-          <w:rFonts w:hint="eastAsia"/>
-          <w:color w:val="FF0000"/>
-        </w:rPr>
-        <w:t>；访问页表未命中</w:t>
-      </w:r>
-      <w:r>
-        <w:rPr>
-          <w:rFonts w:hint="eastAsia"/>
-          <w:color w:val="FF0000"/>
-        </w:rPr>
-        <w:t>(100ns)</w:t>
-      </w:r>
-      <w:r>
-        <w:rPr>
-          <w:rFonts w:hint="eastAsia"/>
-          <w:color w:val="FF0000"/>
-        </w:rPr>
-        <w:t>；发生缺页中断</w:t>
-      </w:r>
-      <w:r>
-        <w:rPr>
-          <w:rFonts w:hint="eastAsia"/>
-          <w:color w:val="FF0000"/>
-        </w:rPr>
-        <w:t>(108ns)</w:t>
-      </w:r>
-      <w:r>
-        <w:rPr>
-          <w:rFonts w:hint="eastAsia"/>
-          <w:color w:val="FF0000"/>
-        </w:rPr>
-        <w:t>；访问</w:t>
-      </w:r>
-      <w:r>
-        <w:rPr>
-          <w:rFonts w:hint="eastAsia"/>
-          <w:color w:val="FF0000"/>
-        </w:rPr>
-        <w:t>TLB</w:t>
-      </w:r>
-      <w:r>
-        <w:rPr>
-          <w:rFonts w:hint="eastAsia"/>
-          <w:color w:val="FF0000"/>
-        </w:rPr>
-        <w:t>命中</w:t>
-      </w:r>
-      <w:r>
-        <w:rPr>
-          <w:rFonts w:hint="eastAsia"/>
-          <w:color w:val="FF0000"/>
-        </w:rPr>
-        <w:t>1</w:t>
-      </w:r>
-      <w:r>
-        <w:rPr>
-          <w:rFonts w:hint="eastAsia"/>
-          <w:color w:val="FF0000"/>
-        </w:rPr>
-        <w:t>号页面</w:t>
-      </w:r>
-      <w:r>
-        <w:rPr>
-          <w:rFonts w:hint="eastAsia"/>
-          <w:color w:val="FF0000"/>
-        </w:rPr>
-        <w:t>(10ns)</w:t>
-      </w:r>
-      <w:r>
-        <w:rPr>
-          <w:rFonts w:hint="eastAsia"/>
-          <w:color w:val="FF0000"/>
-        </w:rPr>
-        <w:t>；得到物理地址访问内存</w:t>
-      </w:r>
-      <w:r>
-        <w:rPr>
-          <w:rFonts w:hint="eastAsia"/>
-          <w:color w:val="FF0000"/>
-        </w:rPr>
-        <w:t>(100ns)</w:t>
-      </w:r>
-      <w:r>
-        <w:rPr>
-          <w:rFonts w:hint="eastAsia"/>
-          <w:color w:val="FF0000"/>
-        </w:rPr>
-        <w:t>。此时驻留集已满</w:t>
-      </w:r>
-      <w:r>
-        <w:rPr>
-          <w:rFonts w:hint="eastAsia"/>
-          <w:color w:val="FF0000"/>
-        </w:rPr>
-        <w:t>(0</w:t>
-      </w:r>
-      <w:r>
-        <w:rPr>
-          <w:rFonts w:hint="eastAsia"/>
-          <w:color w:val="FF0000"/>
-        </w:rPr>
-        <w:t>号页面和</w:t>
-      </w:r>
-      <w:r>
-        <w:rPr>
-          <w:rFonts w:hint="eastAsia"/>
-          <w:color w:val="FF0000"/>
-        </w:rPr>
-        <w:t>2</w:t>
-      </w:r>
-      <w:r>
-        <w:rPr>
-          <w:rFonts w:hint="eastAsia"/>
-          <w:color w:val="FF0000"/>
-        </w:rPr>
-        <w:t>号页面</w:t>
-      </w:r>
-      <w:r>
-        <w:rPr>
-          <w:rFonts w:hint="eastAsia"/>
-          <w:color w:val="FF0000"/>
-        </w:rPr>
-        <w:t>)</w:t>
-      </w:r>
-    </w:p>
-    <w:p>
-      <w:pPr>
-        <w:pStyle w:val="ListParagraph"/>
-        <w:ind w:left="380"/>
-        <w:rPr>
-          <w:color w:val="FF0000"/>
-        </w:rPr>
-      </w:pPr>
-    </w:p>
-    <w:p>
-      <w:pPr>
-        <w:pStyle w:val="ListParagraph"/>
-        <w:ind w:left="380"/>
-        <w:rPr>
-          <w:rFonts w:hint="eastAsia"/>
-          <w:color w:val="FF0000"/>
-        </w:rPr>
-      </w:pPr>
-      <w:r>
-        <w:rPr>
-          <w:rFonts w:hint="eastAsia"/>
-          <w:color w:val="FF0000"/>
-        </w:rPr>
-        <w:t>故逻辑地址</w:t>
-      </w:r>
-      <w:r>
-        <w:rPr>
-          <w:rFonts w:hint="eastAsia"/>
-          <w:color w:val="FF0000"/>
-        </w:rPr>
-        <w:t>1565H</w:t>
-      </w:r>
-      <w:r>
-        <w:rPr>
-          <w:rFonts w:hint="eastAsia"/>
-          <w:color w:val="FF0000"/>
-        </w:rPr>
-        <w:t>的访问时间为：</w:t>
-      </w:r>
-    </w:p>
-    <w:p>
-      <w:pPr>
-        <w:pStyle w:val="ListParagraph"/>
-        <w:ind w:left="380"/>
-        <w:rPr>
-          <w:color w:val="FF0000"/>
-        </w:rPr>
-      </w:pPr>
-      <w:r>
-        <w:rPr>
-          <w:rFonts w:hint="eastAsia"/>
-          <w:color w:val="FF0000"/>
-        </w:rPr>
-        <w:t>EAT=</w:t>
-      </w:r>
-      <w:proofErr w:type="spellStart"/>
-      <w:r>
-        <w:rPr>
-          <w:rFonts w:hint="eastAsia"/>
-          <w:color w:val="FF0000"/>
-        </w:rPr>
-        <w:t>a+t+T+a+t</w:t>
-      </w:r>
-      <w:proofErr w:type="spellEnd"/>
-      <w:r>
-        <w:rPr>
-          <w:rFonts w:hint="eastAsia"/>
-          <w:color w:val="FF0000"/>
-        </w:rPr>
-        <w:t>=T+2</w:t>
-      </w:r>
-      <w:r>
-        <w:rPr>
-          <w:rFonts w:hint="eastAsia"/>
-          <w:color w:val="FF0000"/>
-        </w:rPr>
-        <w:t>×</w:t>
-      </w:r>
-      <w:r>
-        <w:rPr>
-          <w:rFonts w:hint="eastAsia"/>
-          <w:color w:val="FF0000"/>
-        </w:rPr>
-        <w:t>(</w:t>
-      </w:r>
-      <w:proofErr w:type="spellStart"/>
-      <w:r>
-        <w:rPr>
-          <w:rFonts w:hint="eastAsia"/>
-          <w:color w:val="FF0000"/>
-        </w:rPr>
-        <w:t>a+t</w:t>
-      </w:r>
-      <w:proofErr w:type="spellEnd"/>
-      <w:r>
-        <w:rPr>
-          <w:rFonts w:hint="eastAsia"/>
-          <w:color w:val="FF0000"/>
-        </w:rPr>
-        <w:t>)=108+2</w:t>
-      </w:r>
-      <w:r>
-        <w:rPr>
-          <w:rFonts w:hint="eastAsia"/>
-          <w:color w:val="FF0000"/>
-        </w:rPr>
-        <w:t>×</w:t>
-      </w:r>
-      <w:r>
-        <w:rPr>
-          <w:rFonts w:hint="eastAsia"/>
-          <w:color w:val="FF0000"/>
-        </w:rPr>
-        <w:t>(100+10)=100000220ns</w:t>
+          <w:rFonts w:hint="eastAsia"/>
+          <w:color w:val="FF0000"/>
+        </w:rPr>
+      </w:pPr>
+      <w:r>
+        <w:rPr>
+          <w:rFonts w:hint="eastAsia"/>
+          <w:color w:val="FF0000"/>
+        </w:rPr>
+        <w:t>则地址由</w:t>
+      </w:r>
+      <w:proofErr w:type="gramStart"/>
+      <w:r>
+        <w:rPr>
+          <w:rFonts w:hint="eastAsia"/>
+          <w:color w:val="FF0000"/>
+        </w:rPr>
+        <w:t>内存块号和</w:t>
+      </w:r>
+      <w:proofErr w:type="gramEnd"/>
+      <w:r>
+        <w:rPr>
+          <w:rFonts w:hint="eastAsia"/>
+          <w:color w:val="FF0000"/>
+        </w:rPr>
+        <w:t>页内偏移量拼接得到物理地址为：</w:t>
+      </w:r>
+      <w:r>
+        <w:rPr>
+          <w:rFonts w:hint="eastAsia"/>
+          <w:color w:val="FF0000"/>
+        </w:rPr>
+        <w:t>101565H</w:t>
       </w:r>
       <w:r>
         <w:rPr>
@@ -3098,392 +3744,7 @@
     </w:p>
     <w:p>
       <w:pPr>
-        <w:pStyle w:val="ListParagraph"/>
-        <w:ind w:left="380"/>
-        <w:rPr>
-          <w:rFonts w:hint="eastAsia"/>
-          <w:color w:val="FF0000"/>
-        </w:rPr>
-      </w:pPr>
-    </w:p>
-    <w:p>
-      <w:pPr>
-        <w:pStyle w:val="ListParagraph"/>
-        <w:ind w:left="380"/>
-        <w:rPr>
-          <w:rFonts w:hint="eastAsia"/>
-          <w:color w:val="FF0000"/>
-        </w:rPr>
-      </w:pPr>
-      <w:r>
-        <w:rPr>
-          <w:rFonts w:hint="eastAsia"/>
-          <w:color w:val="FF0000"/>
-        </w:rPr>
-        <w:t>对于逻辑地址</w:t>
-      </w:r>
-      <w:r>
-        <w:rPr>
-          <w:rFonts w:hint="eastAsia"/>
-          <w:color w:val="FF0000"/>
-        </w:rPr>
-        <w:t>25A5H</w:t>
-      </w:r>
-      <w:r>
-        <w:rPr>
-          <w:rFonts w:hint="eastAsia"/>
-          <w:color w:val="FF0000"/>
-        </w:rPr>
-        <w:t>，其表示的页号为</w:t>
-      </w:r>
-      <w:r>
-        <w:rPr>
-          <w:rFonts w:hint="eastAsia"/>
-          <w:color w:val="FF0000"/>
-        </w:rPr>
-        <w:t>2</w:t>
-      </w:r>
-      <w:r>
-        <w:rPr>
-          <w:rFonts w:hint="eastAsia"/>
-          <w:color w:val="FF0000"/>
-        </w:rPr>
-        <w:t>，访问次序依次为：访问</w:t>
-      </w:r>
-      <w:r>
-        <w:rPr>
-          <w:rFonts w:hint="eastAsia"/>
-          <w:color w:val="FF0000"/>
-        </w:rPr>
-        <w:t>TLB</w:t>
-      </w:r>
-      <w:r>
-        <w:rPr>
-          <w:rFonts w:hint="eastAsia"/>
-          <w:color w:val="FF0000"/>
-        </w:rPr>
-        <w:t>命中二号页面</w:t>
-      </w:r>
-      <w:r>
-        <w:rPr>
-          <w:rFonts w:hint="eastAsia"/>
-          <w:color w:val="FF0000"/>
-        </w:rPr>
-        <w:t>(10ns)</w:t>
-      </w:r>
-      <w:r>
-        <w:rPr>
-          <w:rFonts w:hint="eastAsia"/>
-          <w:color w:val="FF0000"/>
-        </w:rPr>
-        <w:t>；得到物理地址访问内存</w:t>
-      </w:r>
-      <w:r>
-        <w:rPr>
-          <w:rFonts w:hint="eastAsia"/>
-          <w:color w:val="FF0000"/>
-        </w:rPr>
-        <w:t>(100ns)</w:t>
-      </w:r>
-      <w:r>
-        <w:rPr>
-          <w:rFonts w:hint="eastAsia"/>
-          <w:color w:val="FF0000"/>
-        </w:rPr>
-        <w:t>。</w:t>
-      </w:r>
-    </w:p>
-    <w:p>
-      <w:pPr>
-        <w:pStyle w:val="ListParagraph"/>
-        <w:ind w:left="380"/>
-        <w:rPr>
-          <w:color w:val="FF0000"/>
-        </w:rPr>
-      </w:pPr>
-    </w:p>
-    <w:p>
-      <w:pPr>
-        <w:pStyle w:val="ListParagraph"/>
-        <w:ind w:left="380"/>
-        <w:rPr>
-          <w:color w:val="FF0000"/>
-        </w:rPr>
-      </w:pPr>
-      <w:r>
-        <w:rPr>
-          <w:rFonts w:hint="eastAsia"/>
-          <w:color w:val="FF0000"/>
-        </w:rPr>
-        <w:t>故逻辑地址</w:t>
-      </w:r>
-      <w:r>
-        <w:rPr>
-          <w:rFonts w:hint="eastAsia"/>
-          <w:color w:val="FF0000"/>
-        </w:rPr>
-        <w:t>25A5H</w:t>
-      </w:r>
-      <w:r>
-        <w:rPr>
-          <w:rFonts w:hint="eastAsia"/>
-          <w:color w:val="FF0000"/>
-        </w:rPr>
-        <w:t>的访问时间为</w:t>
-      </w:r>
-      <w:r>
-        <w:rPr>
-          <w:rFonts w:hint="eastAsia"/>
-          <w:color w:val="FF0000"/>
-        </w:rPr>
-        <w:t>:EAT=</w:t>
-      </w:r>
-      <w:proofErr w:type="spellStart"/>
-      <w:r>
-        <w:rPr>
-          <w:rFonts w:hint="eastAsia"/>
-          <w:color w:val="FF0000"/>
-        </w:rPr>
-        <w:t>a+t</w:t>
-      </w:r>
-      <w:proofErr w:type="spellEnd"/>
-      <w:r>
-        <w:rPr>
-          <w:rFonts w:hint="eastAsia"/>
-          <w:color w:val="FF0000"/>
-        </w:rPr>
-        <w:t>=10+100=110ns;</w:t>
-      </w:r>
-    </w:p>
-    <w:p>
-      <w:pPr>
-        <w:pStyle w:val="ListParagraph"/>
-        <w:ind w:left="380"/>
-        <w:rPr>
-          <w:color w:val="FF0000"/>
-        </w:rPr>
-      </w:pPr>
-    </w:p>
-    <w:p>
-      <w:pPr>
-        <w:pStyle w:val="ListParagraph"/>
-        <w:ind w:left="380"/>
-        <w:rPr>
-          <w:rFonts w:hint="eastAsia"/>
-          <w:color w:val="FF0000"/>
-        </w:rPr>
-      </w:pPr>
-      <w:r>
-        <w:rPr>
-          <w:color w:val="FF0000"/>
-        </w:rPr>
-        <w:t>2</w:t>
-      </w:r>
-      <w:r>
-        <w:rPr>
-          <w:rFonts w:hint="eastAsia"/>
-          <w:color w:val="FF0000"/>
-        </w:rPr>
-        <w:t>)</w:t>
-      </w:r>
-      <w:r>
-        <w:rPr>
-          <w:rFonts w:hint="eastAsia"/>
-          <w:color w:val="FF0000"/>
-        </w:rPr>
-        <w:t>访问逻辑地址</w:t>
-      </w:r>
-      <w:r>
-        <w:rPr>
-          <w:rFonts w:hint="eastAsia"/>
-          <w:color w:val="FF0000"/>
-        </w:rPr>
-        <w:t>1565H</w:t>
-      </w:r>
-      <w:r>
-        <w:rPr>
-          <w:rFonts w:hint="eastAsia"/>
-          <w:color w:val="FF0000"/>
-        </w:rPr>
-        <w:t>时由于驻留集已满</w:t>
-      </w:r>
-      <w:r>
-        <w:rPr>
-          <w:rFonts w:hint="eastAsia"/>
-          <w:color w:val="FF0000"/>
-        </w:rPr>
-        <w:t>(0</w:t>
-      </w:r>
-      <w:r>
-        <w:rPr>
-          <w:rFonts w:hint="eastAsia"/>
-          <w:color w:val="FF0000"/>
-        </w:rPr>
-        <w:t>号页面和</w:t>
-      </w:r>
-      <w:r>
-        <w:rPr>
-          <w:rFonts w:hint="eastAsia"/>
-          <w:color w:val="FF0000"/>
-        </w:rPr>
-        <w:t>2</w:t>
-      </w:r>
-      <w:r>
-        <w:rPr>
-          <w:rFonts w:hint="eastAsia"/>
-          <w:color w:val="FF0000"/>
-        </w:rPr>
-        <w:t>号页面</w:t>
-      </w:r>
-      <w:r>
-        <w:rPr>
-          <w:rFonts w:hint="eastAsia"/>
-          <w:color w:val="FF0000"/>
-        </w:rPr>
-        <w:t>)</w:t>
-      </w:r>
-      <w:r>
-        <w:rPr>
-          <w:rFonts w:hint="eastAsia"/>
-          <w:color w:val="FF0000"/>
-        </w:rPr>
-        <w:t>。故应从页表中淘汰一个页面，根据</w:t>
-      </w:r>
-      <w:r>
-        <w:rPr>
-          <w:rFonts w:hint="eastAsia"/>
-          <w:color w:val="FF0000"/>
-        </w:rPr>
-        <w:t>LRU</w:t>
-      </w:r>
-      <w:r>
-        <w:rPr>
-          <w:rFonts w:hint="eastAsia"/>
-          <w:color w:val="FF0000"/>
-        </w:rPr>
-        <w:t>算法，</w:t>
-      </w:r>
-      <w:r>
-        <w:rPr>
-          <w:rFonts w:hint="eastAsia"/>
-          <w:color w:val="FF0000"/>
-        </w:rPr>
-        <w:t>2</w:t>
-      </w:r>
-      <w:r>
-        <w:rPr>
-          <w:rFonts w:hint="eastAsia"/>
-          <w:color w:val="FF0000"/>
-        </w:rPr>
-        <w:t>号页面刚被使用过，故淘汰</w:t>
-      </w:r>
-      <w:r>
-        <w:rPr>
-          <w:rFonts w:hint="eastAsia"/>
-          <w:color w:val="FF0000"/>
-        </w:rPr>
-        <w:t>0</w:t>
-      </w:r>
-      <w:r>
-        <w:rPr>
-          <w:rFonts w:hint="eastAsia"/>
-          <w:color w:val="FF0000"/>
-        </w:rPr>
-        <w:t>号页面，将</w:t>
-      </w:r>
-      <w:r>
-        <w:rPr>
-          <w:rFonts w:hint="eastAsia"/>
-          <w:color w:val="FF0000"/>
-        </w:rPr>
-        <w:t>1</w:t>
-      </w:r>
-      <w:r>
-        <w:rPr>
-          <w:rFonts w:hint="eastAsia"/>
-          <w:color w:val="FF0000"/>
-        </w:rPr>
-        <w:t>号页面调入获得内存块号</w:t>
-      </w:r>
-      <w:r>
-        <w:rPr>
-          <w:rFonts w:hint="eastAsia"/>
-          <w:color w:val="FF0000"/>
-        </w:rPr>
-        <w:t>101H</w:t>
-      </w:r>
-      <w:r>
-        <w:rPr>
-          <w:rFonts w:hint="eastAsia"/>
-          <w:color w:val="FF0000"/>
-        </w:rPr>
-        <w:t>。</w:t>
-      </w:r>
-    </w:p>
-    <w:p>
-      <w:pPr>
-        <w:pStyle w:val="ListParagraph"/>
-        <w:ind w:left="380"/>
-        <w:rPr>
-          <w:color w:val="FF0000"/>
-        </w:rPr>
-      </w:pPr>
-    </w:p>
-    <w:p>
-      <w:pPr>
-        <w:pStyle w:val="ListParagraph"/>
-        <w:ind w:left="380"/>
-        <w:rPr>
-          <w:rFonts w:hint="eastAsia"/>
-          <w:color w:val="FF0000"/>
-        </w:rPr>
-      </w:pPr>
-      <w:r>
-        <w:rPr>
-          <w:rFonts w:hint="eastAsia"/>
-          <w:color w:val="FF0000"/>
-        </w:rPr>
-        <w:t>则地址由内存块号和页内偏移量拼接得到物理地址为：</w:t>
-      </w:r>
-      <w:r>
-        <w:rPr>
-          <w:rFonts w:hint="eastAsia"/>
-          <w:color w:val="FF0000"/>
-        </w:rPr>
-        <w:t>101565H</w:t>
-      </w:r>
-      <w:r>
-        <w:rPr>
-          <w:rFonts w:hint="eastAsia"/>
-          <w:color w:val="FF0000"/>
-        </w:rPr>
-        <w:t>。</w:t>
-      </w:r>
-    </w:p>
-    <w:p>
-      <w:pPr>
-        <w:pStyle w:val="ListParagraph"/>
-        <w:ind w:left="380"/>
-        <w:jc w:val="center"/>
-      </w:pPr>
-    </w:p>
-    <w:p>
-      <w:pPr>
-        <w:pStyle w:val="ListParagraph"/>
-        <w:ind w:left="380"/>
-        <w:jc w:val="center"/>
-      </w:pPr>
-    </w:p>
-    <w:p>
-      <w:pPr>
-        <w:pStyle w:val="ListParagraph"/>
-        <w:ind w:left="380"/>
-        <w:jc w:val="center"/>
-      </w:pPr>
-    </w:p>
-    <w:p>
-      <w:pPr>
-        <w:pStyle w:val="ListParagraph"/>
+        <w:pStyle w:val="a3"/>
         <w:numPr>
           <w:ilvl w:val="0"/>
           <w:numId w:val="1"/>
@@ -3494,7 +3755,21 @@
         <w:rPr>
           <w:rFonts w:hint="eastAsia"/>
         </w:rPr>
-        <w:t>某请求分页系统的局部页面置换策略如下：</w:t>
+        <w:t>某请求分</w:t>
+      </w:r>
+      <w:proofErr w:type="gramStart"/>
+      <w:r>
+        <w:rPr>
+          <w:rFonts w:hint="eastAsia"/>
+        </w:rPr>
+        <w:t>页系统</w:t>
+      </w:r>
+      <w:proofErr w:type="gramEnd"/>
+      <w:r>
+        <w:rPr>
+          <w:rFonts w:hint="eastAsia"/>
+        </w:rPr>
+        <w:t>的局部页面置换策略如下：</w:t>
       </w:r>
       <w:r>
         <w:rPr>
@@ -3530,7 +3805,21 @@
         <w:rPr>
           <w:rFonts w:hint="eastAsia"/>
         </w:rPr>
-        <w:t>个时间单位扫描一轮驻留集（扫描时间忽略不计），本轮没有被访问过的页框将被系统回收，并放入到空闲页框链尾，其中内容在下一次被分配之前不被清空。当发生缺页时，如果该页曾被使用过且还在空闲页框链表中，则重新放回进程的驻留集中；否则，从空闲页框链表头部取出一个页框。</w:t>
+        <w:t>个时间单位扫描一轮驻留集（扫描时间忽略不计），本轮没有被访问过的页框将被系统回收，并放入到空闲页</w:t>
+      </w:r>
+      <w:proofErr w:type="gramStart"/>
+      <w:r>
+        <w:rPr>
+          <w:rFonts w:hint="eastAsia"/>
+        </w:rPr>
+        <w:t>框链尾</w:t>
+      </w:r>
+      <w:proofErr w:type="gramEnd"/>
+      <w:r>
+        <w:rPr>
+          <w:rFonts w:hint="eastAsia"/>
+        </w:rPr>
+        <w:t>，其中内容在下一次被分配之前不被清空。当发生缺页时，如果该页曾被使用过且还在空闲页框链表中，则重新放回进程的驻留集中；否则，从空闲页框链表头部取出一个页框。</w:t>
       </w:r>
       <w:r>
         <w:rPr>
@@ -3721,12 +4010,12 @@
     </w:p>
     <w:p>
       <w:pPr>
-        <w:pStyle w:val="ListParagraph"/>
-      </w:pPr>
-    </w:p>
-    <w:p>
-      <w:pPr>
-        <w:pStyle w:val="ListParagraph"/>
+        <w:pStyle w:val="a3"/>
+      </w:pPr>
+    </w:p>
+    <w:p>
+      <w:pPr>
+        <w:pStyle w:val="a3"/>
         <w:ind w:left="380"/>
       </w:pPr>
       <w:r>
@@ -3858,13 +4147,13 @@
     </w:p>
     <w:p>
       <w:pPr>
-        <w:pStyle w:val="ListParagraph"/>
+        <w:pStyle w:val="a3"/>
         <w:ind w:left="380"/>
       </w:pPr>
     </w:p>
     <w:p>
       <w:pPr>
-        <w:pStyle w:val="ListParagraph"/>
+        <w:pStyle w:val="a3"/>
         <w:ind w:left="380"/>
       </w:pPr>
       <w:r>
@@ -3916,13 +4205,13 @@
     </w:p>
     <w:p>
       <w:pPr>
-        <w:pStyle w:val="ListParagraph"/>
+        <w:pStyle w:val="a3"/>
         <w:ind w:left="380"/>
       </w:pPr>
     </w:p>
     <w:p>
       <w:pPr>
-        <w:pStyle w:val="ListParagraph"/>
+        <w:pStyle w:val="a3"/>
         <w:ind w:left="380"/>
         <w:rPr>
           <w:color w:val="FF0000"/>
@@ -3933,24 +4222,23 @@
           <w:rFonts w:hint="eastAsia"/>
           <w:color w:val="FF0000"/>
         </w:rPr>
+        <w:lastRenderedPageBreak/>
         <w:t>参考上表</w:t>
       </w:r>
     </w:p>
     <w:p>
       <w:pPr>
-        <w:pStyle w:val="ListParagraph"/>
+        <w:pStyle w:val="a3"/>
         <w:ind w:left="380"/>
         <w:rPr>
-          <w:rFonts w:hint="eastAsia"/>
-          <w:color w:val="FF0000"/>
-        </w:rPr>
-      </w:pPr>
-      <w:r>
-        <w:rPr>
-          <w:rFonts w:hint="eastAsia"/>
-          <w:color w:val="FF0000"/>
-        </w:rPr>
-        <w:lastRenderedPageBreak/>
+          <w:color w:val="FF0000"/>
+        </w:rPr>
+      </w:pPr>
+      <w:r>
+        <w:rPr>
+          <w:rFonts w:hint="eastAsia"/>
+          <w:color w:val="FF0000"/>
+        </w:rPr>
         <w:t>1</w:t>
       </w:r>
       <w:r>
@@ -3988,13 +4276,19 @@
         </w:rPr>
         <w:t>。</w:t>
       </w:r>
-    </w:p>
-    <w:p>
-      <w:pPr>
-        <w:pStyle w:val="ListParagraph"/>
+      <w:r>
+        <w:rPr>
+          <w:rFonts w:hint="eastAsia"/>
+          <w:color w:val="FF0000"/>
+        </w:rPr>
+        <w:t>写对了</w:t>
+      </w:r>
+    </w:p>
+    <w:p>
+      <w:pPr>
+        <w:pStyle w:val="a3"/>
         <w:ind w:left="380"/>
         <w:rPr>
-          <w:rFonts w:hint="eastAsia"/>
           <w:color w:val="FF0000"/>
         </w:rPr>
       </w:pPr>
@@ -4029,7 +4323,7 @@
     </w:p>
     <w:p>
       <w:pPr>
-        <w:pStyle w:val="ListParagraph"/>
+        <w:pStyle w:val="a3"/>
         <w:ind w:left="380"/>
         <w:rPr>
           <w:color w:val="FF0000"/>
@@ -4038,10 +4332,9 @@
     </w:p>
     <w:p>
       <w:pPr>
-        <w:pStyle w:val="ListParagraph"/>
+        <w:pStyle w:val="a3"/>
         <w:ind w:left="380"/>
         <w:rPr>
-          <w:rFonts w:hint="eastAsia"/>
           <w:color w:val="FF0000"/>
         </w:rPr>
       </w:pPr>
@@ -4087,13 +4380,39 @@
         </w:rPr>
         <w:t>。</w:t>
       </w:r>
-    </w:p>
-    <w:p>
-      <w:pPr>
-        <w:pStyle w:val="ListParagraph"/>
+      <w:r>
+        <w:rPr>
+          <w:rFonts w:hint="eastAsia"/>
+          <w:color w:val="FF0000"/>
+        </w:rPr>
+        <w:t>因为曾被使用过</w:t>
+      </w:r>
+      <w:r>
+        <w:rPr>
+          <w:rFonts w:hint="eastAsia"/>
+          <w:color w:val="FF0000"/>
+        </w:rPr>
+        <w:t>.</w:t>
+      </w:r>
+      <w:r>
+        <w:rPr>
+          <w:color w:val="FF0000"/>
+        </w:rPr>
+        <w:t xml:space="preserve">  </w:t>
+      </w:r>
+      <w:r>
+        <w:rPr>
+          <w:rFonts w:hint="eastAsia"/>
+          <w:color w:val="FF0000"/>
+        </w:rPr>
+        <w:t>写对了</w:t>
+      </w:r>
+    </w:p>
+    <w:p>
+      <w:pPr>
+        <w:pStyle w:val="a3"/>
         <w:ind w:left="380"/>
         <w:rPr>
-          <w:rFonts w:hint="eastAsia"/>
           <w:color w:val="FF0000"/>
         </w:rPr>
       </w:pPr>
@@ -4319,7 +4638,14 @@
           <w:rFonts w:hint="eastAsia"/>
           <w:color w:val="FF0000"/>
         </w:rPr>
-        <w:t>号虚拟页假如空闲页链表中。在访问</w:t>
+        <w:t>号虚拟页加入</w:t>
+      </w:r>
+      <w:r>
+        <w:rPr>
+          <w:rFonts w:hint="eastAsia"/>
+          <w:color w:val="FF0000"/>
+        </w:rPr>
+        <w:t>空闲页链表中。在访问</w:t>
       </w:r>
       <w:r>
         <w:rPr>
@@ -4352,10 +4678,9 @@
     </w:p>
     <w:p>
       <w:pPr>
-        <w:pStyle w:val="ListParagraph"/>
+        <w:pStyle w:val="a3"/>
         <w:ind w:left="380"/>
         <w:rPr>
-          <w:rFonts w:hint="eastAsia"/>
           <w:color w:val="FF0000"/>
         </w:rPr>
       </w:pPr>
@@ -4383,7 +4708,7 @@
     </w:p>
     <w:p>
       <w:pPr>
-        <w:pStyle w:val="ListParagraph"/>
+        <w:pStyle w:val="a3"/>
         <w:ind w:left="380"/>
         <w:rPr>
           <w:color w:val="FF0000"/>
@@ -4392,10 +4717,9 @@
     </w:p>
     <w:p>
       <w:pPr>
-        <w:pStyle w:val="ListParagraph"/>
+        <w:pStyle w:val="a3"/>
         <w:ind w:left="380"/>
         <w:rPr>
-          <w:rFonts w:hint="eastAsia"/>
           <w:color w:val="FF0000"/>
         </w:rPr>
       </w:pPr>
@@ -4425,8 +4749,17 @@
           <w:rFonts w:hint="eastAsia"/>
           <w:color w:val="FF0000"/>
         </w:rPr>
-        <w:t>时，对应的页框号为</w:t>
-      </w:r>
+        <w:t>时，对应的</w:t>
+      </w:r>
+      <w:proofErr w:type="gramStart"/>
+      <w:r>
+        <w:rPr>
+          <w:rFonts w:hint="eastAsia"/>
+          <w:color w:val="FF0000"/>
+        </w:rPr>
+        <w:t>页框号为</w:t>
+      </w:r>
+      <w:proofErr w:type="gramEnd"/>
       <w:r>
         <w:rPr>
           <w:rFonts w:hint="eastAsia"/>
@@ -4441,13 +4774,26 @@
         </w:rPr>
         <w:t>。</w:t>
       </w:r>
-    </w:p>
-    <w:p>
-      <w:pPr>
-        <w:pStyle w:val="ListParagraph"/>
+      <w:r>
+        <w:rPr>
+          <w:rFonts w:hint="eastAsia"/>
+          <w:color w:val="FF0000"/>
+        </w:rPr>
+        <w:t xml:space="preserve"> </w:t>
+      </w:r>
+      <w:r>
+        <w:rPr>
+          <w:rFonts w:hint="eastAsia"/>
+          <w:color w:val="FF0000"/>
+        </w:rPr>
+        <w:t>我写对了</w:t>
+      </w:r>
+    </w:p>
+    <w:p>
+      <w:pPr>
+        <w:pStyle w:val="a3"/>
         <w:ind w:left="380"/>
         <w:rPr>
-          <w:rFonts w:hint="eastAsia"/>
           <w:color w:val="FF0000"/>
         </w:rPr>
       </w:pPr>
@@ -4463,7 +4809,23 @@
           <w:rFonts w:hint="eastAsia"/>
           <w:color w:val="FF0000"/>
         </w:rPr>
-        <w:t>为第七个访问，此时发生缺页，故从空闲页框链表表头</w:t>
+        <w:t>为第七个访问，此时发生缺页，故从空闲页框链表</w:t>
+      </w:r>
+      <w:proofErr w:type="gramStart"/>
+      <w:r>
+        <w:rPr>
+          <w:rFonts w:hint="eastAsia"/>
+          <w:color w:val="FF0000"/>
+        </w:rPr>
+        <w:t>表</w:t>
+      </w:r>
+      <w:proofErr w:type="gramEnd"/>
+      <w:r>
+        <w:rPr>
+          <w:rFonts w:hint="eastAsia"/>
+          <w:color w:val="FF0000"/>
+        </w:rPr>
+        <w:t>头</w:t>
       </w:r>
       <w:r>
         <w:rPr>
@@ -4477,8 +4839,17 @@
           <w:rFonts w:hint="eastAsia"/>
           <w:color w:val="FF0000"/>
         </w:rPr>
-        <w:t>即页框链表指针所指的空闲页框号</w:t>
-      </w:r>
+        <w:t>即页框链表指针所指的空闲</w:t>
+      </w:r>
+      <w:proofErr w:type="gramStart"/>
+      <w:r>
+        <w:rPr>
+          <w:rFonts w:hint="eastAsia"/>
+          <w:color w:val="FF0000"/>
+        </w:rPr>
+        <w:t>页框号</w:t>
+      </w:r>
+      <w:proofErr w:type="gramEnd"/>
       <w:r>
         <w:rPr>
           <w:rFonts w:hint="eastAsia"/>
@@ -4491,8 +4862,17 @@
           <w:rFonts w:hint="eastAsia"/>
           <w:color w:val="FF0000"/>
         </w:rPr>
-        <w:t>取出空闲页框号为</w:t>
-      </w:r>
+        <w:t>取出空闲</w:t>
+      </w:r>
+      <w:proofErr w:type="gramStart"/>
+      <w:r>
+        <w:rPr>
+          <w:rFonts w:hint="eastAsia"/>
+          <w:color w:val="FF0000"/>
+        </w:rPr>
+        <w:t>页框号为</w:t>
+      </w:r>
+      <w:proofErr w:type="gramEnd"/>
       <w:r>
         <w:rPr>
           <w:rFonts w:hint="eastAsia"/>
@@ -4510,7 +4890,7 @@
     </w:p>
     <w:p>
       <w:pPr>
-        <w:pStyle w:val="ListParagraph"/>
+        <w:pStyle w:val="a3"/>
         <w:ind w:left="380"/>
         <w:rPr>
           <w:color w:val="FF0000"/>
@@ -4519,10 +4899,9 @@
     </w:p>
     <w:p>
       <w:pPr>
-        <w:pStyle w:val="ListParagraph"/>
+        <w:pStyle w:val="a3"/>
         <w:ind w:left="380"/>
         <w:rPr>
-          <w:rFonts w:hint="eastAsia"/>
           <w:color w:val="FF0000"/>
         </w:rPr>
       </w:pPr>
@@ -4543,31 +4922,31 @@
     </w:p>
     <w:p>
       <w:pPr>
-        <w:pStyle w:val="ListParagraph"/>
+        <w:pStyle w:val="a3"/>
         <w:ind w:left="380"/>
       </w:pPr>
     </w:p>
     <w:p>
       <w:pPr>
-        <w:pStyle w:val="ListParagraph"/>
+        <w:pStyle w:val="a3"/>
         <w:ind w:left="380"/>
       </w:pPr>
     </w:p>
     <w:p>
       <w:pPr>
-        <w:pStyle w:val="ListParagraph"/>
+        <w:pStyle w:val="a3"/>
         <w:ind w:left="380"/>
       </w:pPr>
     </w:p>
     <w:p>
       <w:pPr>
-        <w:pStyle w:val="ListParagraph"/>
+        <w:pStyle w:val="a3"/>
         <w:ind w:left="380"/>
       </w:pPr>
     </w:p>
     <w:p>
       <w:pPr>
-        <w:pStyle w:val="ListParagraph"/>
+        <w:pStyle w:val="a3"/>
         <w:numPr>
           <w:ilvl w:val="0"/>
           <w:numId w:val="1"/>
@@ -4613,7 +4992,7 @@
     </w:p>
     <w:p>
       <w:pPr>
-        <w:pStyle w:val="ListParagraph"/>
+        <w:pStyle w:val="a3"/>
         <w:ind w:left="740"/>
       </w:pPr>
       <w:r>
@@ -4643,7 +5022,7 @@
     </w:p>
     <w:p>
       <w:pPr>
-        <w:pStyle w:val="ListParagraph"/>
+        <w:pStyle w:val="a3"/>
         <w:ind w:left="740"/>
       </w:pPr>
       <w:r>
@@ -4695,13 +5074,13 @@
     </w:p>
     <w:p>
       <w:pPr>
-        <w:pStyle w:val="ListParagraph"/>
+        <w:pStyle w:val="a3"/>
         <w:ind w:left="740"/>
       </w:pPr>
     </w:p>
     <w:p>
       <w:pPr>
-        <w:pStyle w:val="ListParagraph"/>
+        <w:pStyle w:val="a3"/>
         <w:ind w:left="0" w:firstLine="740"/>
       </w:pPr>
       <w:r>
@@ -4719,16 +5098,18 @@
     </w:p>
     <w:p>
       <w:pPr>
-        <w:pStyle w:val="ListParagraph"/>
+        <w:pStyle w:val="a3"/>
         <w:ind w:left="0" w:firstLine="740"/>
         <w:rPr>
           <w:color w:val="FF0000"/>
         </w:rPr>
       </w:pPr>
-    </w:p>
-    <w:p>
-      <w:pPr>
-        <w:pStyle w:val="ListParagraph"/>
+      <w:bookmarkStart w:id="0" w:name="_GoBack"/>
+      <w:bookmarkEnd w:id="0"/>
+    </w:p>
+    <w:p>
+      <w:pPr>
+        <w:pStyle w:val="a3"/>
         <w:ind w:left="0" w:firstLine="740"/>
         <w:rPr>
           <w:color w:val="FF0000"/>
@@ -4757,13 +5138,13 @@
     </w:p>
     <w:p>
       <w:pPr>
-        <w:pStyle w:val="ListParagraph"/>
+        <w:pStyle w:val="a3"/>
         <w:ind w:left="0" w:firstLine="740"/>
       </w:pPr>
     </w:p>
     <w:p>
       <w:pPr>
-        <w:pStyle w:val="ListParagraph"/>
+        <w:pStyle w:val="a3"/>
         <w:ind w:left="740"/>
       </w:pPr>
       <w:r>
@@ -4793,7 +5174,7 @@
     </w:p>
     <w:p>
       <w:pPr>
-        <w:pStyle w:val="ListParagraph"/>
+        <w:pStyle w:val="a3"/>
         <w:ind w:left="740"/>
       </w:pPr>
       <w:r>
@@ -4845,13 +5226,13 @@
     </w:p>
     <w:p>
       <w:pPr>
-        <w:pStyle w:val="ListParagraph"/>
+        <w:pStyle w:val="a3"/>
         <w:ind w:left="740"/>
       </w:pPr>
     </w:p>
     <w:p>
       <w:pPr>
-        <w:pStyle w:val="ListParagraph"/>
+        <w:pStyle w:val="a3"/>
         <w:ind w:left="740"/>
       </w:pPr>
       <w:r>
@@ -4875,13 +5256,13 @@
     </w:p>
     <w:p>
       <w:pPr>
-        <w:pStyle w:val="ListParagraph"/>
+        <w:pStyle w:val="a3"/>
         <w:ind w:left="740"/>
       </w:pPr>
     </w:p>
     <w:p>
       <w:pPr>
-        <w:pStyle w:val="ListParagraph"/>
+        <w:pStyle w:val="a3"/>
         <w:ind w:left="740"/>
         <w:rPr>
           <w:color w:val="FF0000"/>
@@ -4904,19 +5285,7 @@
         <w:rPr>
           <w:color w:val="FF0000"/>
         </w:rPr>
-        <w:t>3FF = 00000000</w:t>
-      </w:r>
-      <w:r>
-        <w:rPr>
-          <w:color w:val="FF0000"/>
-        </w:rPr>
-        <w:t>1111111111</w:t>
-      </w:r>
-      <w:r>
-        <w:rPr>
-          <w:color w:val="FF0000"/>
-        </w:rPr>
-        <w:t xml:space="preserve"> (</w:t>
+        <w:t>3FF = 000000001111111111 (</w:t>
       </w:r>
       <w:r>
         <w:rPr>
@@ -4948,7 +5317,7 @@
     </w:p>
     <w:p>
       <w:pPr>
-        <w:pStyle w:val="ListParagraph"/>
+        <w:pStyle w:val="a3"/>
         <w:ind w:left="740"/>
         <w:rPr>
           <w:color w:val="FF0000"/>
@@ -4963,7 +5332,7 @@
     </w:p>
     <w:p>
       <w:pPr>
-        <w:pStyle w:val="ListParagraph"/>
+        <w:pStyle w:val="a3"/>
         <w:ind w:left="740"/>
         <w:rPr>
           <w:color w:val="FF0000"/>
@@ -4973,19 +5342,19 @@
         <w:rPr>
           <w:color w:val="FF0000"/>
         </w:rPr>
+        <w:lastRenderedPageBreak/>
         <w:t>Page No: (LA&gt;&gt;12) &amp; 0x3FF</w:t>
       </w:r>
     </w:p>
     <w:p>
       <w:pPr>
-        <w:pStyle w:val="ListParagraph"/>
+        <w:pStyle w:val="a3"/>
         <w:ind w:left="740"/>
       </w:pPr>
       <w:r>
         <w:rPr>
           <w:rFonts w:hint="eastAsia"/>
         </w:rPr>
-        <w:lastRenderedPageBreak/>
         <w:t xml:space="preserve"> (3)</w:t>
       </w:r>
       <w:r>
@@ -5093,7 +5462,7 @@
     </w:p>
     <w:p>
       <w:pPr>
-        <w:pStyle w:val="ListParagraph"/>
+        <w:pStyle w:val="a3"/>
         <w:ind w:left="740"/>
         <w:jc w:val="center"/>
       </w:pPr>
@@ -5147,7 +5516,7 @@
     </w:p>
     <w:p>
       <w:pPr>
-        <w:pStyle w:val="ListParagraph"/>
+        <w:pStyle w:val="a3"/>
         <w:ind w:left="740"/>
         <w:rPr>
           <w:color w:val="FF0000"/>
@@ -5156,7 +5525,7 @@
     </w:p>
     <w:p>
       <w:pPr>
-        <w:pStyle w:val="ListParagraph"/>
+        <w:pStyle w:val="a3"/>
         <w:ind w:left="740"/>
         <w:rPr>
           <w:color w:val="FF0000"/>
@@ -5192,7 +5561,7 @@
     </w:p>
     <w:p>
       <w:pPr>
-        <w:pStyle w:val="ListParagraph"/>
+        <w:pStyle w:val="a3"/>
         <w:ind w:left="740"/>
         <w:rPr>
           <w:color w:val="FF0000"/>
@@ -5221,7 +5590,7 @@
     </w:p>
     <w:p>
       <w:pPr>
-        <w:pStyle w:val="ListParagraph"/>
+        <w:pStyle w:val="a3"/>
         <w:ind w:left="740"/>
         <w:rPr>
           <w:color w:val="FF0000"/>
@@ -5257,39 +5626,31 @@
     </w:p>
     <w:p>
       <w:pPr>
-        <w:pStyle w:val="ListParagraph"/>
+        <w:pStyle w:val="a3"/>
         <w:ind w:left="740"/>
       </w:pPr>
     </w:p>
     <w:p>
       <w:pPr>
-        <w:pStyle w:val="ListParagraph"/>
+        <w:pStyle w:val="a3"/>
         <w:ind w:left="740"/>
       </w:pPr>
     </w:p>
     <w:p>
       <w:pPr>
-        <w:pStyle w:val="ListParagraph"/>
+        <w:pStyle w:val="a3"/>
         <w:numPr>
           <w:ilvl w:val="0"/>
           <w:numId w:val="1"/>
         </w:numPr>
       </w:pPr>
       <w:r>
-        <w:t xml:space="preserve">A system with 32-bit addresses, 1 GB (230) main memory, and a </w:t>
-      </w:r>
-      <w:proofErr w:type="gramStart"/>
-      <w:r>
-        <w:t>1 megabyte</w:t>
-      </w:r>
-      <w:proofErr w:type="gramEnd"/>
-      <w:r>
-        <w:t xml:space="preserve"> (20-bit) page size will have a page table that contains: </w:t>
-      </w:r>
-    </w:p>
-    <w:p>
-      <w:pPr>
-        <w:pStyle w:val="ListParagraph"/>
+        <w:t xml:space="preserve">A system with 32-bit addresses, 1 GB (230) main memory, and a 1 megabyte (20-bit) page size will have a page table that contains: </w:t>
+      </w:r>
+    </w:p>
+    <w:p>
+      <w:pPr>
+        <w:pStyle w:val="a3"/>
       </w:pPr>
       <w:r>
         <w:rPr>
@@ -5333,12 +5694,12 @@
     </w:p>
     <w:p>
       <w:pPr>
-        <w:pStyle w:val="ListParagraph"/>
-      </w:pPr>
-    </w:p>
-    <w:p>
-      <w:pPr>
-        <w:pStyle w:val="ListParagraph"/>
+        <w:pStyle w:val="a3"/>
+      </w:pPr>
+    </w:p>
+    <w:p>
+      <w:pPr>
+        <w:pStyle w:val="a3"/>
         <w:numPr>
           <w:ilvl w:val="0"/>
           <w:numId w:val="1"/>
@@ -5350,7 +5711,7 @@
     </w:p>
     <w:p>
       <w:pPr>
-        <w:pStyle w:val="ListParagraph"/>
+        <w:pStyle w:val="a3"/>
       </w:pPr>
       <w:r>
         <w:t>A. 0 bytes</w:t>
@@ -5396,7 +5757,7 @@
 </file>
 
 <file path=word/numbering.xml><?xml version="1.0" encoding="utf-8"?>
-<w:numbering xmlns:wpc="http://schemas.microsoft.com/office/word/2010/wordprocessingCanvas" xmlns:cx="http://schemas.microsoft.com/office/drawing/2014/chartex" xmlns:cx1="http://schemas.microsoft.com/office/drawing/2015/9/8/chartex" xmlns:cx2="http://schemas.microsoft.com/office/drawing/2015/10/21/chartex" xmlns:cx3="http://schemas.microsoft.com/office/drawing/2016/5/9/chartex" xmlns:cx4="http://schemas.microsoft.com/office/drawing/2016/5/10/chartex" xmlns:cx5="http://schemas.microsoft.com/office/drawing/2016/5/11/chartex" xmlns:cx6="http://schemas.microsoft.com/office/drawing/2016/5/12/chartex" xmlns:cx7="http://schemas.microsoft.com/office/drawing/2016/5/13/chartex" xmlns:cx8="http://schemas.microsoft.com/office/drawing/2016/5/14/chartex" xmlns:mc="http://schemas.openxmlformats.org/markup-compatibility/2006" xmlns:aink="http://schemas.microsoft.com/office/drawing/2016/ink" xmlns:am3d="http://schemas.microsoft.com/office/drawing/2017/model3d" xmlns:o="urn:schemas-microsoft-com:office:office" xmlns:r="http://schemas.openxmlformats.org/officeDocument/2006/relationships" xmlns:m="http://schemas.openxmlformats.org/officeDocument/2006/math" xmlns:v="urn:schemas-microsoft-com:vml" xmlns:wp14="http://schemas.microsoft.com/office/word/2010/wordprocessingDrawing" xmlns:wp="http://schemas.openxmlformats.org/drawingml/2006/wordprocessingDrawing" xmlns:w10="urn:schemas-microsoft-com:office:word" xmlns:w="http://schemas.openxmlformats.org/wordprocessingml/2006/main" xmlns:w14="http://schemas.microsoft.com/office/word/2010/wordml" xmlns:w15="http://schemas.microsoft.com/office/word/2012/wordml" xmlns:w16cex="http://schemas.microsoft.com/office/word/2018/wordml/cex" xmlns:w16cid="http://schemas.microsoft.com/office/word/2016/wordml/cid" xmlns:w16="http://schemas.microsoft.com/office/word/2018/wordml" xmlns:w16sdtdh="http://schemas.microsoft.com/office/word/2020/wordml/sdtdatahash" xmlns:w16se="http://schemas.microsoft.com/office/word/2015/wordml/symex" xmlns:wpg="http://schemas.microsoft.com/office/word/2010/wordprocessingGroup" xmlns:wpi="http://schemas.microsoft.com/office/word/2010/wordprocessingInk" xmlns:wne="http://schemas.microsoft.com/office/word/2006/wordml" xmlns:wps="http://schemas.microsoft.com/office/word/2010/wordprocessingShape" mc:Ignorable="w14 w15 w16se w16cid w16 w16cex w16sdtdh wp14">
+<w:numbering xmlns:wpc="http://schemas.microsoft.com/office/word/2010/wordprocessingCanvas" xmlns:cx="http://schemas.microsoft.com/office/drawing/2014/chartex" xmlns:mc="http://schemas.openxmlformats.org/markup-compatibility/2006" xmlns:o="urn:schemas-microsoft-com:office:office" xmlns:r="http://schemas.openxmlformats.org/officeDocument/2006/relationships" xmlns:m="http://schemas.openxmlformats.org/officeDocument/2006/math" xmlns:v="urn:schemas-microsoft-com:vml" xmlns:wp14="http://schemas.microsoft.com/office/word/2010/wordprocessingDrawing" xmlns:wp="http://schemas.openxmlformats.org/drawingml/2006/wordprocessingDrawing" xmlns:w10="urn:schemas-microsoft-com:office:word" xmlns:w="http://schemas.openxmlformats.org/wordprocessingml/2006/main" xmlns:w14="http://schemas.microsoft.com/office/word/2010/wordml" xmlns:w15="http://schemas.microsoft.com/office/word/2012/wordml" xmlns:w16se="http://schemas.microsoft.com/office/word/2015/wordml/symex" xmlns:wpg="http://schemas.microsoft.com/office/word/2010/wordprocessingGroup" xmlns:wpi="http://schemas.microsoft.com/office/word/2010/wordprocessingInk" xmlns:wne="http://schemas.microsoft.com/office/word/2006/wordml" xmlns:wps="http://schemas.microsoft.com/office/word/2010/wordprocessingShape" mc:Ignorable="w14 w15 w16se wp14">
   <w:abstractNum w:abstractNumId="0" w15:restartNumberingAfterBreak="0">
     <w:nsid w:val="0AE06F55"/>
     <w:multiLevelType w:val="hybridMultilevel"/>
@@ -6808,7 +7169,7 @@
 </file>
 
 <file path=word/styles.xml><?xml version="1.0" encoding="utf-8"?>
-<w:styles xmlns:mc="http://schemas.openxmlformats.org/markup-compatibility/2006" xmlns:r="http://schemas.openxmlformats.org/officeDocument/2006/relationships" xmlns:w="http://schemas.openxmlformats.org/wordprocessingml/2006/main" xmlns:w14="http://schemas.microsoft.com/office/word/2010/wordml" xmlns:w15="http://schemas.microsoft.com/office/word/2012/wordml" xmlns:w16cex="http://schemas.microsoft.com/office/word/2018/wordml/cex" xmlns:w16cid="http://schemas.microsoft.com/office/word/2016/wordml/cid" xmlns:w16="http://schemas.microsoft.com/office/word/2018/wordml" xmlns:w16sdtdh="http://schemas.microsoft.com/office/word/2020/wordml/sdtdatahash" xmlns:w16se="http://schemas.microsoft.com/office/word/2015/wordml/symex" mc:Ignorable="w14 w15 w16se w16cid w16 w16cex w16sdtdh">
+<w:styles xmlns:mc="http://schemas.openxmlformats.org/markup-compatibility/2006" xmlns:r="http://schemas.openxmlformats.org/officeDocument/2006/relationships" xmlns:w="http://schemas.openxmlformats.org/wordprocessingml/2006/main" xmlns:w14="http://schemas.microsoft.com/office/word/2010/wordml" xmlns:w15="http://schemas.microsoft.com/office/word/2012/wordml" xmlns:w16se="http://schemas.microsoft.com/office/word/2015/wordml/symex" mc:Ignorable="w14 w15 w16se">
   <w:docDefaults>
     <w:rPrDefault>
       <w:rPr>
@@ -6820,7 +7181,7 @@
     </w:rPrDefault>
     <w:pPrDefault/>
   </w:docDefaults>
-  <w:latentStyles w:defLockedState="0" w:defUIPriority="99" w:defSemiHidden="0" w:defUnhideWhenUsed="0" w:defQFormat="0" w:count="376">
+  <w:latentStyles w:defLockedState="0" w:defUIPriority="99" w:defSemiHidden="0" w:defUnhideWhenUsed="0" w:defQFormat="0" w:count="371">
     <w:lsdException w:name="Normal" w:uiPriority="0" w:qFormat="1"/>
     <w:lsdException w:name="heading 1" w:uiPriority="9" w:qFormat="1"/>
     <w:lsdException w:name="heading 2" w:semiHidden="1" w:uiPriority="9" w:unhideWhenUsed="1" w:qFormat="1"/>
@@ -7192,21 +7553,16 @@
     <w:lsdException w:name="List Table 5 Dark Accent 6" w:uiPriority="50"/>
     <w:lsdException w:name="List Table 6 Colorful Accent 6" w:uiPriority="51"/>
     <w:lsdException w:name="List Table 7 Colorful Accent 6" w:uiPriority="52"/>
-    <w:lsdException w:name="Mention" w:semiHidden="1" w:unhideWhenUsed="1"/>
-    <w:lsdException w:name="Smart Hyperlink" w:semiHidden="1" w:unhideWhenUsed="1"/>
-    <w:lsdException w:name="Hashtag" w:semiHidden="1" w:unhideWhenUsed="1"/>
-    <w:lsdException w:name="Unresolved Mention" w:semiHidden="1" w:unhideWhenUsed="1"/>
-    <w:lsdException w:name="Smart Link" w:semiHidden="1" w:unhideWhenUsed="1"/>
   </w:latentStyles>
-  <w:style w:type="paragraph" w:default="1" w:styleId="Normal">
+  <w:style w:type="paragraph" w:default="1" w:styleId="a">
     <w:name w:val="Normal"/>
     <w:qFormat/>
   </w:style>
-  <w:style w:type="paragraph" w:styleId="Heading1">
+  <w:style w:type="paragraph" w:styleId="1">
     <w:name w:val="heading 1"/>
-    <w:basedOn w:val="Normal"/>
-    <w:next w:val="Normal"/>
-    <w:link w:val="Heading1Char"/>
+    <w:basedOn w:val="a"/>
+    <w:next w:val="a"/>
+    <w:link w:val="10"/>
     <w:uiPriority w:val="9"/>
     <w:qFormat/>
     <w:rsid w:val="002A753F"/>
@@ -7223,13 +7579,13 @@
       <w:szCs w:val="32"/>
     </w:rPr>
   </w:style>
-  <w:style w:type="character" w:default="1" w:styleId="DefaultParagraphFont">
+  <w:style w:type="character" w:default="1" w:styleId="a0">
     <w:name w:val="Default Paragraph Font"/>
     <w:uiPriority w:val="1"/>
     <w:semiHidden/>
     <w:unhideWhenUsed/>
   </w:style>
-  <w:style w:type="table" w:default="1" w:styleId="TableNormal">
+  <w:style w:type="table" w:default="1" w:styleId="a1">
     <w:name w:val="Normal Table"/>
     <w:uiPriority w:val="99"/>
     <w:semiHidden/>
@@ -7244,16 +7600,16 @@
       </w:tblCellMar>
     </w:tblPr>
   </w:style>
-  <w:style w:type="numbering" w:default="1" w:styleId="NoList">
+  <w:style w:type="numbering" w:default="1" w:styleId="a2">
     <w:name w:val="No List"/>
     <w:uiPriority w:val="99"/>
     <w:semiHidden/>
     <w:unhideWhenUsed/>
   </w:style>
-  <w:style w:type="character" w:customStyle="1" w:styleId="Heading1Char">
-    <w:name w:val="Heading 1 Char"/>
-    <w:basedOn w:val="DefaultParagraphFont"/>
-    <w:link w:val="Heading1"/>
+  <w:style w:type="character" w:customStyle="1" w:styleId="10">
+    <w:name w:val="标题 1 字符"/>
+    <w:basedOn w:val="a0"/>
+    <w:link w:val="1"/>
     <w:uiPriority w:val="9"/>
     <w:rsid w:val="002A753F"/>
     <w:rPr>
@@ -7263,9 +7619,9 @@
       <w:szCs w:val="32"/>
     </w:rPr>
   </w:style>
-  <w:style w:type="paragraph" w:styleId="ListParagraph">
+  <w:style w:type="paragraph" w:styleId="a3">
     <w:name w:val="List Paragraph"/>
-    <w:basedOn w:val="Normal"/>
+    <w:basedOn w:val="a"/>
     <w:uiPriority w:val="34"/>
     <w:qFormat/>
     <w:rsid w:val="002A753F"/>

</xml_diff>